<commit_message>
new journal target, revised manuscript, updated webapp with formulas
Co-Authored-By: Claude Opus 4.7 (1M context) <noreply@anthropic.com>
</commit_message>
<xml_diff>
--- a/submission/manuscript.docx
+++ b/submission/manuscript.docx
@@ -40,147 +40,85 @@
         <w:pStyle w:val="FirstParagraph"/>
       </w:pPr>
       <w:r>
-        <w:t xml:space="preserve">Reform efforts in statistics education have, for two decades, urged that</w:t>
-      </w:r>
-      <w:r>
-        <w:t xml:space="preserve"> </w:t>
-      </w:r>
-      <w:r>
-        <w:t xml:space="preserve">introductory instruction be reorganized around simulation-based reasoning, in</w:t>
-      </w:r>
-      <w:r>
-        <w:t xml:space="preserve"> </w:t>
-      </w:r>
-      <w:r>
-        <w:t xml:space="preserve">which students construct a sampling distribution empirically before they meet</w:t>
-      </w:r>
-      <w:r>
-        <w:t xml:space="preserve"> </w:t>
-      </w:r>
-      <w:r>
-        <w:t xml:space="preserve">it as a formula. The software that supports this approach, however, is</w:t>
-      </w:r>
-      <w:r>
-        <w:t xml:space="preserve"> </w:t>
-      </w:r>
-      <w:r>
-        <w:t xml:space="preserve">typically</w:t>
-      </w:r>
-      <w:r>
-        <w:t xml:space="preserve"> </w:t>
-      </w:r>
-      <w:r>
-        <w:rPr>
-          <w:i/>
-          <w:iCs/>
-        </w:rPr>
-        <w:t xml:space="preserve">siloed</w:t>
-      </w:r>
-      <w:r>
-        <w:t xml:space="preserve">: each applet or visualization addresses a single concept,</w:t>
-      </w:r>
-      <w:r>
-        <w:t xml:space="preserve"> </w:t>
-      </w:r>
-      <w:r>
-        <w:t xml:space="preserve">and its output cannot be passed to the next step of an analysis, so the</w:t>
-      </w:r>
-      <w:r>
-        <w:t xml:space="preserve"> </w:t>
-      </w:r>
-      <w:r>
-        <w:t xml:space="preserve">data-generating-process → sampling → estimation → inference → diagnostics</w:t>
-      </w:r>
-      <w:r>
-        <w:t xml:space="preserve"> </w:t>
-      </w:r>
-      <w:r>
-        <w:t xml:space="preserve">workflow that students must internalize is left implicit. This article</w:t>
-      </w:r>
-      <w:r>
-        <w:t xml:space="preserve"> </w:t>
-      </w:r>
-      <w:r>
-        <w:t xml:space="preserve">describes</w:t>
-      </w:r>
-      <w:r>
-        <w:t xml:space="preserve"> </w:t>
-      </w:r>
-      <w:r>
-        <w:rPr>
-          <w:b/>
-          <w:bCs/>
-        </w:rPr>
-        <w:t xml:space="preserve">Empiria</w:t>
-      </w:r>
-      <w:r>
-        <w:t xml:space="preserve">, an open-source, browser-based environment that makes</w:t>
-      </w:r>
-      <w:r>
-        <w:t xml:space="preserve"> </w:t>
-      </w:r>
-      <w:r>
-        <w:t xml:space="preserve">that workflow explicit by representing it as a composable dataflow graph:</w:t>
-      </w:r>
-      <w:r>
-        <w:t xml:space="preserve"> </w:t>
-      </w:r>
-      <w:r>
-        <w:t xml:space="preserve">students wire small modules together with cables and observe every</w:t>
-      </w:r>
-      <w:r>
-        <w:t xml:space="preserve"> </w:t>
-      </w:r>
-      <w:r>
-        <w:t xml:space="preserve">intermediate quantity update in real time. Empiria runs with no installation</w:t>
-      </w:r>
-      <w:r>
-        <w:t xml:space="preserve"> </w:t>
-      </w:r>
-      <w:r>
-        <w:t xml:space="preserve">on any modern device, ships sixteen guided lessons and a four-step tour, and</w:t>
-      </w:r>
-      <w:r>
-        <w:t xml:space="preserve"> </w:t>
-      </w:r>
-      <w:r>
-        <w:t xml:space="preserve">exports figures, data (CSV), and fully reproducible patches (as files or</w:t>
-      </w:r>
-      <w:r>
-        <w:t xml:space="preserve"> </w:t>
-      </w:r>
-      <w:r>
-        <w:t xml:space="preserve">shareable links). Its numerical routines use exact recipes rather than</w:t>
-      </w:r>
-      <w:r>
-        <w:t xml:space="preserve"> </w:t>
-      </w:r>
-      <w:r>
-        <w:t xml:space="preserve">normal-theory approximations and are verified against R to machine precision by</w:t>
-      </w:r>
-      <w:r>
-        <w:t xml:space="preserve"> </w:t>
-      </w:r>
-      <w:r>
-        <w:t xml:space="preserve">an automated test suite, so the tool is auditable as well as legible. We</w:t>
-      </w:r>
-      <w:r>
-        <w:t xml:space="preserve"> </w:t>
-      </w:r>
-      <w:r>
-        <w:t xml:space="preserve">describe the design, the module library, the pedagogical rationale, and the</w:t>
-      </w:r>
-      <w:r>
-        <w:t xml:space="preserve"> </w:t>
-      </w:r>
-      <w:r>
-        <w:t xml:space="preserve">verification methodology, and we outline a planned classroom evaluation.</w:t>
-      </w:r>
-      <w:r>
-        <w:t xml:space="preserve"> </w:t>
-      </w:r>
-      <w:r>
-        <w:t xml:space="preserve">Empiria is released under GPL-3.0 and is available at</w:t>
+        <w:t xml:space="preserve">Simulation-based reasoning—building a sampling distribution empirically before</w:t>
+      </w:r>
+      <w:r>
+        <w:t xml:space="preserve"> </w:t>
+      </w:r>
+      <w:r>
+        <w:t xml:space="preserve">meeting it as a formula—is now central to statistics teaching, but the</w:t>
+      </w:r>
+      <w:r>
+        <w:t xml:space="preserve"> </w:t>
+      </w:r>
+      <w:r>
+        <w:t xml:space="preserve">supporting software is typically siloed: each applet addresses one concept and</w:t>
+      </w:r>
+      <w:r>
+        <w:t xml:space="preserve"> </w:t>
+      </w:r>
+      <w:r>
+        <w:t xml:space="preserve">its output cannot feed the next step, so the workflow students must internalize</w:t>
+      </w:r>
+      <w:r>
+        <w:t xml:space="preserve"> </w:t>
+      </w:r>
+      <w:r>
+        <w:t xml:space="preserve">stays implicit. This article describes Empiria, a free, open-source,</w:t>
+      </w:r>
+      <w:r>
+        <w:t xml:space="preserve"> </w:t>
+      </w:r>
+      <w:r>
+        <w:t xml:space="preserve">browser-based environment that makes that workflow explicit by representing it</w:t>
+      </w:r>
+      <w:r>
+        <w:t xml:space="preserve"> </w:t>
+      </w:r>
+      <w:r>
+        <w:t xml:space="preserve">as a composable dataflow graph: students wire small modules together with</w:t>
+      </w:r>
+      <w:r>
+        <w:t xml:space="preserve"> </w:t>
+      </w:r>
+      <w:r>
+        <w:t xml:space="preserve">cables and watch every intermediate quantity update in real time—optionally</w:t>
+      </w:r>
+      <w:r>
+        <w:t xml:space="preserve"> </w:t>
+      </w:r>
+      <w:r>
+        <w:t xml:space="preserve">beside the live mathematical formula each node computes. Empiria runs</w:t>
+      </w:r>
+      <w:r>
+        <w:t xml:space="preserve"> </w:t>
+      </w:r>
+      <w:r>
+        <w:t xml:space="preserve">with no installation on any modern device, ships sixteen guided lessons and a</w:t>
+      </w:r>
+      <w:r>
+        <w:t xml:space="preserve"> </w:t>
+      </w:r>
+      <w:r>
+        <w:t xml:space="preserve">short tour, and exports figures, data, and fully reproducible patches. Its</w:t>
+      </w:r>
+      <w:r>
+        <w:t xml:space="preserve"> </w:t>
+      </w:r>
+      <w:r>
+        <w:t xml:space="preserve">closed-form routines are verified against R to machine precision and its</w:t>
+      </w:r>
+      <w:r>
+        <w:t xml:space="preserve"> </w:t>
+      </w:r>
+      <w:r>
+        <w:t xml:space="preserve">randomised procedures against published reference values, so the tool is</w:t>
+      </w:r>
+      <w:r>
+        <w:t xml:space="preserve"> </w:t>
+      </w:r>
+      <w:r>
+        <w:t xml:space="preserve">auditable as well as legible. It is available at</w:t>
       </w:r>
       <w:r>
         <w:t xml:space="preserve"> </w:t>
@@ -212,13 +150,19 @@
         <w:t xml:space="preserve"> </w:t>
       </w:r>
       <w:r>
-        <w:t xml:space="preserve">simulation-based inference; statistics education; sampling</w:t>
-      </w:r>
-      <w:r>
-        <w:t xml:space="preserve"> </w:t>
-      </w:r>
-      <w:r>
-        <w:t xml:space="preserve">distributions; bootstrap; reproducibility; educational technology; dataflow</w:t>
+        <w:t xml:space="preserve">Teaching Statistics; simulation-based inference; statistics</w:t>
+      </w:r>
+      <w:r>
+        <w:t xml:space="preserve"> </w:t>
+      </w:r>
+      <w:r>
+        <w:t xml:space="preserve">education; sampling distributions; bootstrap; reproducibility; educational</w:t>
+      </w:r>
+      <w:r>
+        <w:t xml:space="preserve"> </w:t>
+      </w:r>
+      <w:r>
+        <w:t xml:space="preserve">technology; dataflow</w:t>
       </w:r>
     </w:p>
     <w:bookmarkEnd w:id="10"/>
@@ -266,13 +210,19 @@
         <w:t xml:space="preserve"> </w:t>
       </w:r>
       <w:r>
-        <w:t xml:space="preserve">is named; the simulation-based-inference movement subsequently demonstrated</w:t>
-      </w:r>
-      <w:r>
-        <w:t xml:space="preserve"> </w:t>
-      </w:r>
-      <w:r>
-        <w:t xml:space="preserve">measurable gains in students’ reasoning about</w:t>
+        <w:t xml:space="preserve">is named; the simulation-based-inference movement subsequently built curricula</w:t>
+      </w:r>
+      <w:r>
+        <w:t xml:space="preserve"> </w:t>
+      </w:r>
+      <w:r>
+        <w:t xml:space="preserve">around that idea (Rossman &amp; Chance, 2014) and reported measurable gains in</w:t>
+      </w:r>
+      <w:r>
+        <w:t xml:space="preserve"> </w:t>
+      </w:r>
+      <w:r>
+        <w:t xml:space="preserve">students’ reasoning about</w:t>
       </w:r>
       <w:r>
         <w:t xml:space="preserve"> </w:t>
@@ -285,13 +235,13 @@
         <w:t xml:space="preserve">p</w:t>
       </w:r>
       <w:r>
-        <w:t xml:space="preserve">-values and confidence</w:t>
-      </w:r>
-      <w:r>
-        <w:t xml:space="preserve"> </w:t>
-      </w:r>
-      <w:r>
-        <w:t xml:space="preserve">intervals (Tintle et al., 2015), and the GAISE College Report codified the</w:t>
+        <w:t xml:space="preserve">-values and confidence intervals (Tintle et al.,</w:t>
+      </w:r>
+      <w:r>
+        <w:t xml:space="preserve"> </w:t>
+      </w:r>
+      <w:r>
+        <w:t xml:space="preserve">2015), and the GAISE College Report codified the</w:t>
       </w:r>
       <w:r>
         <w:t xml:space="preserve"> </w:t>
@@ -303,13 +253,7 @@
         <w:t xml:space="preserve"> </w:t>
       </w:r>
       <w:r>
-        <w:t xml:space="preserve">technology, and emphasize statistical thinking (American Statistical</w:t>
-      </w:r>
-      <w:r>
-        <w:t xml:space="preserve"> </w:t>
-      </w:r>
-      <w:r>
-        <w:t xml:space="preserve">Association, 2016). A sustained research literature documents</w:t>
+        <w:t xml:space="preserve">technology, and emphasize statistical thinking (American Statistical Association, 2016). A sustained research literature documents</w:t>
       </w:r>
       <w:r>
         <w:t xml:space="preserve"> </w:t>
@@ -343,13 +287,7 @@
         <w:t xml:space="preserve"> </w:t>
       </w:r>
       <w:r>
-        <w:t xml:space="preserve">manipulating parameters and observing the consequences in real time (Chance et</w:t>
-      </w:r>
-      <w:r>
-        <w:t xml:space="preserve"> </w:t>
-      </w:r>
-      <w:r>
-        <w:t xml:space="preserve">al., 2004; delMas et al., 2007; Garfield &amp; Ben-Zvi, 2009).</w:t>
+        <w:t xml:space="preserve">manipulating parameters and observing the consequences in real time (Chance et al., 2004; delMas et al., 2007; Garfield &amp; Ben-Zvi, 2009).</w:t>
       </w:r>
     </w:p>
     <w:p>
@@ -379,13 +317,7 @@
         <w:t xml:space="preserve"> </w:t>
       </w:r>
       <w:r>
-        <w:t xml:space="preserve">Sampling-distribution visualizers address sampling variability (Chance et al.,</w:t>
-      </w:r>
-      <w:r>
-        <w:t xml:space="preserve"> </w:t>
-      </w:r>
-      <w:r>
-        <w:t xml:space="preserve">2004; delMas et al., 2007); TinkerPlots supports school-level exploratory</w:t>
+        <w:t xml:space="preserve">Sampling-distribution visualizers address sampling variability (Chance et al., 2004; delMas et al., 2007); TinkerPlots supports school-level exploratory</w:t>
       </w:r>
       <w:r>
         <w:t xml:space="preserve"> </w:t>
@@ -403,13 +335,19 @@
         <w:t xml:space="preserve"> </w:t>
       </w:r>
       <w:r>
-        <w:t xml:space="preserve">environment (Wilensky, 1999); and a large number of single-purpose applets</w:t>
-      </w:r>
-      <w:r>
-        <w:t xml:space="preserve"> </w:t>
-      </w:r>
-      <w:r>
-        <w:t xml:space="preserve">(for example, the</w:t>
+        <w:t xml:space="preserve">environment (Wilensky, 1999); StatKey supports a full simulation-based-inference</w:t>
+      </w:r>
+      <w:r>
+        <w:t xml:space="preserve"> </w:t>
+      </w:r>
+      <w:r>
+        <w:t xml:space="preserve">curriculum in the browser (Lock et al., 2021); and a large number of</w:t>
+      </w:r>
+      <w:r>
+        <w:t xml:space="preserve"> </w:t>
+      </w:r>
+      <w:r>
+        <w:t xml:space="preserve">single-purpose applets (for example, the</w:t>
       </w:r>
       <w:r>
         <w:t xml:space="preserve"> </w:t>
@@ -425,7 +363,7 @@
         <w:t xml:space="preserve"> </w:t>
       </w:r>
       <w:r>
-        <w:t xml:space="preserve">applet collection and</w:t>
+        <w:t xml:space="preserve">collection and</w:t>
       </w:r>
       <w:r>
         <w:t xml:space="preserve"> </w:t>
@@ -438,13 +376,13 @@
         <w:t xml:space="preserve">Seeing Theory</w:t>
       </w:r>
       <w:r>
-        <w:t xml:space="preserve">) and</w:t>
-      </w:r>
-      <w:r>
-        <w:t xml:space="preserve"> </w:t>
-      </w:r>
-      <w:r>
-        <w:t xml:space="preserve">instructor-built R Shiny dashboards address specific techniques. Each of these</w:t>
+        <w:t xml:space="preserve">) and instructor-built R Shiny dashboards address specific</w:t>
+      </w:r>
+      <w:r>
+        <w:t xml:space="preserve"> </w:t>
+      </w:r>
+      <w:r>
+        <w:t xml:space="preserve">techniques. Each of these</w:t>
       </w:r>
       <w:r>
         <w:t xml:space="preserve"> </w:t>
@@ -602,19 +540,31 @@
         <w:t xml:space="preserve"> </w:t>
       </w:r>
       <w:r>
+        <w:t xml:space="preserve">live mathematical-notation view that renders each module’s formula with the</w:t>
+      </w:r>
+      <w:r>
+        <w:t xml:space="preserve"> </w:t>
+      </w:r>
+      <w:r>
+        <w:t xml:space="preserve">current values substituted, tying symbolic form to direct manipulation; (3) a</w:t>
+      </w:r>
+      <w:r>
+        <w:t xml:space="preserve"> </w:t>
+      </w:r>
+      <w:r>
         <w:t xml:space="preserve">zero-installation, cross-device implementation with sixteen ready-made lessons</w:t>
       </w:r>
       <w:r>
         <w:t xml:space="preserve"> </w:t>
       </w:r>
       <w:r>
-        <w:t xml:space="preserve">and a guided tour; and (3) a verification methodology—exact numerical recipes,</w:t>
-      </w:r>
-      <w:r>
-        <w:t xml:space="preserve"> </w:t>
-      </w:r>
-      <w:r>
-        <w:t xml:space="preserve">deterministic seeding, and an automated test suite checked against R—that makes</w:t>
+        <w:t xml:space="preserve">and a guided tour; and (4) a verification methodology (exact numerical recipes,</w:t>
+      </w:r>
+      <w:r>
+        <w:t xml:space="preserve"> </w:t>
+      </w:r>
+      <w:r>
+        <w:t xml:space="preserve">deterministic seeding, and an automated test suite checked against R) that makes</w:t>
       </w:r>
       <w:r>
         <w:t xml:space="preserve"> </w:t>
@@ -644,19 +594,19 @@
         <w:t xml:space="preserve"> </w:t>
       </w:r>
       <w:r>
-        <w:t xml:space="preserve">in the statistics-education literature (Chance et al., 2004; delMas et al.,</w:t>
-      </w:r>
-      <w:r>
-        <w:t xml:space="preserve"> </w:t>
-      </w:r>
-      <w:r>
-        <w:t xml:space="preserve">2007), TinkerPlots (Konold &amp; Lehrer, 2008), CODAP (Finzer, 2013), NetLogo</w:t>
-      </w:r>
-      <w:r>
-        <w:t xml:space="preserve"> </w:t>
-      </w:r>
-      <w:r>
-        <w:t xml:space="preserve">(Wilensky, 1999), the</w:t>
+        <w:t xml:space="preserve">in the statistics-education literature (Chance et al., 2004; delMas et al., 2007), TinkerPlots (Konold &amp; Lehrer, 2008), CODAP (Finzer, 2013), NetLogo</w:t>
+      </w:r>
+      <w:r>
+        <w:t xml:space="preserve"> </w:t>
+      </w:r>
+      <w:r>
+        <w:t xml:space="preserve">(Wilensky, 1999), the StatKey tools that accompany a simulation-based-inference</w:t>
+      </w:r>
+      <w:r>
+        <w:t xml:space="preserve"> </w:t>
+      </w:r>
+      <w:r>
+        <w:t xml:space="preserve">curriculum (Lock et al., 2021), the</w:t>
       </w:r>
       <w:r>
         <w:t xml:space="preserve"> </w:t>
@@ -688,13 +638,13 @@
         <w:t xml:space="preserve"> </w:t>
       </w:r>
       <w:r>
-        <w:t xml:space="preserve">applet collections,</w:t>
-      </w:r>
-      <w:r>
-        <w:t xml:space="preserve"> </w:t>
-      </w:r>
-      <w:r>
-        <w:t xml:space="preserve">and the many instructor-authored R Shiny applications. These tools established</w:t>
+        <w:t xml:space="preserve">applet</w:t>
+      </w:r>
+      <w:r>
+        <w:t xml:space="preserve"> </w:t>
+      </w:r>
+      <w:r>
+        <w:t xml:space="preserve">collections, and the many instructor-authored R Shiny applications. These tools established</w:t>
       </w:r>
       <w:r>
         <w:t xml:space="preserve"> </w:t>
@@ -730,25 +680,37 @@
         <w:t xml:space="preserve"> </w:t>
       </w:r>
       <w:r>
-        <w:t xml:space="preserve">rather than a single-purpose application:</w:t>
-      </w:r>
-      <w:r>
-        <w:t xml:space="preserve"> </w:t>
-      </w:r>
-      <w:r>
-        <w:t xml:space="preserve">the output of any module is a signal that can be routed into any other, so a</w:t>
-      </w:r>
-      <w:r>
-        <w:t xml:space="preserve"> </w:t>
-      </w:r>
-      <w:r>
-        <w:t xml:space="preserve">parametric sampler can feed a sampling-window estimator, which can feed a</w:t>
-      </w:r>
-      <w:r>
-        <w:t xml:space="preserve"> </w:t>
-      </w:r>
-      <w:r>
-        <w:t xml:space="preserve">hypothesis test or a bootstrap, with no copy-paste or context switch. Second,</w:t>
+        <w:t xml:space="preserve">rather than a single-purpose application.</w:t>
+      </w:r>
+      <w:r>
+        <w:t xml:space="preserve"> </w:t>
+      </w:r>
+      <w:r>
+        <w:t xml:space="preserve">Even free, browser-based simulation tools such as StatKey present one analysis</w:t>
+      </w:r>
+      <w:r>
+        <w:t xml:space="preserve"> </w:t>
+      </w:r>
+      <w:r>
+        <w:t xml:space="preserve">per screen; in Empiria the output of any module is a signal that can be routed</w:t>
+      </w:r>
+      <w:r>
+        <w:t xml:space="preserve"> </w:t>
+      </w:r>
+      <w:r>
+        <w:t xml:space="preserve">into any other, so a parametric sampler can feed a sampling-window estimator,</w:t>
+      </w:r>
+      <w:r>
+        <w:t xml:space="preserve"> </w:t>
+      </w:r>
+      <w:r>
+        <w:t xml:space="preserve">which can feed a hypothesis test or a bootstrap, with no copy-paste or context</w:t>
+      </w:r>
+      <w:r>
+        <w:t xml:space="preserve"> </w:t>
+      </w:r>
+      <w:r>
+        <w:t xml:space="preserve">switch. Second,</w:t>
       </w:r>
       <w:r>
         <w:t xml:space="preserve"> </w:t>
@@ -812,7 +774,7 @@
       </w:r>
     </w:p>
     <w:bookmarkEnd w:id="12"/>
-    <w:bookmarkStart w:id="16" w:name="design"/>
+    <w:bookmarkStart w:id="20" w:name="design"/>
     <w:p>
       <w:pPr>
         <w:pStyle w:val="Heading1"/>
@@ -821,7 +783,7 @@
         <w:t xml:space="preserve">Design</w:t>
       </w:r>
     </w:p>
-    <w:bookmarkStart w:id="13" w:name="the-dataflow-canvas"/>
+    <w:bookmarkStart w:id="16" w:name="the-dataflow-canvas"/>
     <w:p>
       <w:pPr>
         <w:pStyle w:val="Heading2"/>
@@ -900,19 +862,19 @@
         <w:t xml:space="preserve"> </w:t>
       </w:r>
       <w:r>
-        <w:t xml:space="preserve">computes. The result is that a complete analysis is laid out left to right as a</w:t>
-      </w:r>
-      <w:r>
-        <w:t xml:space="preserve"> </w:t>
-      </w:r>
-      <w:r>
-        <w:t xml:space="preserve">visible chain—source → transform → statistic → display—and every intermediate</w:t>
-      </w:r>
-      <w:r>
-        <w:t xml:space="preserve"> </w:t>
-      </w:r>
-      <w:r>
-        <w:t xml:space="preserve">value is observable as it changes. This interaction model is a deliberate</w:t>
+        <w:t xml:space="preserve">computes. A complete analysis is thus laid out left to right as a visible chain</w:t>
+      </w:r>
+      <w:r>
+        <w:t xml:space="preserve"> </w:t>
+      </w:r>
+      <w:r>
+        <w:t xml:space="preserve">(source → transform → statistic → display), and every intermediate value is</w:t>
+      </w:r>
+      <w:r>
+        <w:t xml:space="preserve"> </w:t>
+      </w:r>
+      <w:r>
+        <w:t xml:space="preserve">observable as it changes (Figure 1). This interaction model is a deliberate</w:t>
       </w:r>
       <w:r>
         <w:t xml:space="preserve"> </w:t>
@@ -954,6 +916,103 @@
         <w:pStyle w:val="BodyText"/>
       </w:pPr>
       <w:r>
+        <w:drawing>
+          <wp:inline>
+            <wp:extent cx="5334000" cy="3294529"/>
+            <wp:effectExtent b="0" l="0" r="0" t="0"/>
+            <wp:docPr descr="Two-sample comparison assembled on the Empiria canvas" title="" id="14" name="Picture"/>
+            <a:graphic>
+              <a:graphicData uri="http://schemas.openxmlformats.org/drawingml/2006/picture">
+                <pic:pic>
+                  <pic:nvPicPr>
+                    <pic:cNvPr descr="submission/figures/twogroups.png" id="15" name="Picture"/>
+                    <pic:cNvPicPr>
+                      <a:picLocks noChangeArrowheads="1" noChangeAspect="1"/>
+                    </pic:cNvPicPr>
+                  </pic:nvPicPr>
+                  <pic:blipFill>
+                    <a:blip r:embed="rId13"/>
+                    <a:stretch>
+                      <a:fillRect/>
+                    </a:stretch>
+                  </pic:blipFill>
+                  <pic:spPr bwMode="auto">
+                    <a:xfrm>
+                      <a:off x="0" y="0"/>
+                      <a:ext cx="5334000" cy="3294529"/>
+                    </a:xfrm>
+                    <a:prstGeom prst="rect">
+                      <a:avLst/>
+                    </a:prstGeom>
+                    <a:noFill/>
+                    <a:ln w="9525">
+                      <a:noFill/>
+                      <a:headEnd/>
+                      <a:tailEnd/>
+                    </a:ln>
+                  </pic:spPr>
+                </pic:pic>
+              </a:graphicData>
+            </a:graphic>
+          </wp:inline>
+        </w:drawing>
+      </w:r>
+    </w:p>
+    <w:p>
+      <w:pPr>
+        <w:pStyle w:val="BodyText"/>
+      </w:pPr>
+      <w:r>
+        <w:rPr>
+          <w:b/>
+          <w:bCs/>
+        </w:rPr>
+        <w:t xml:space="preserve">Figure 1.</w:t>
+      </w:r>
+      <w:r>
+        <w:t xml:space="preserve"> </w:t>
+      </w:r>
+      <w:r>
+        <w:t xml:space="preserve">A two-sample comparison assembled on the Empiria canvas. Two independent samplers—each drawing from its own population and showing a live histogram—feed a single test node that overlays the</w:t>
+      </w:r>
+      <w:r>
+        <w:t xml:space="preserve"> </w:t>
+      </w:r>
+      <w:r>
+        <w:rPr>
+          <w:i/>
+          <w:iCs/>
+        </w:rPr>
+        <w:t xml:space="preserve">t</w:t>
+      </w:r>
+      <w:r>
+        <w:t xml:space="preserve"> </w:t>
+      </w:r>
+      <w:r>
+        <w:t xml:space="preserve">reference distribution and reports the statistic and decision. The analysis is</w:t>
+      </w:r>
+      <w:r>
+        <w:t xml:space="preserve"> </w:t>
+      </w:r>
+      <w:r>
+        <w:rPr>
+          <w:i/>
+          <w:iCs/>
+        </w:rPr>
+        <w:t xml:space="preserve">built</w:t>
+      </w:r>
+      <w:r>
+        <w:t xml:space="preserve"> </w:t>
+      </w:r>
+      <w:r>
+        <w:t xml:space="preserve">as wired modules rather than invoked as a function call, so the data-generating process → sampling → estimation → inference workflow is laid out left to right with every intermediate quantity visible at once.</w:t>
+      </w:r>
+    </w:p>
+    <w:p>
+      <w:pPr>
+        <w:pStyle w:val="BodyText"/>
+      </w:pPr>
+      <w:r>
         <w:t xml:space="preserve">The clock speed is adjustable from roughly one tick per second—slow enough to</w:t>
       </w:r>
       <w:r>
@@ -993,8 +1052,8 @@
         <w:t xml:space="preserve">support classroom use.</w:t>
       </w:r>
     </w:p>
-    <w:bookmarkEnd w:id="13"/>
-    <w:bookmarkStart w:id="14" w:name="the-engine-and-reproducibility-model"/>
+    <w:bookmarkEnd w:id="16"/>
+    <w:bookmarkStart w:id="17" w:name="the-engine-and-reproducibility-model"/>
     <w:p>
       <w:pPr>
         <w:pStyle w:val="Heading2"/>
@@ -1098,8 +1157,98 @@
         <w:t xml:space="preserve">across operating systems and devices.</w:t>
       </w:r>
     </w:p>
-    <w:bookmarkEnd w:id="14"/>
-    <w:bookmarkStart w:id="15" w:name="the-module-library"/>
+    <w:bookmarkEnd w:id="17"/>
+    <w:bookmarkStart w:id="18" w:name="computational-footprint"/>
+    <w:p>
+      <w:pPr>
+        <w:pStyle w:val="Heading2"/>
+      </w:pPr>
+      <w:r>
+        <w:t xml:space="preserve">Computational footprint</w:t>
+      </w:r>
+    </w:p>
+    <w:p>
+      <w:pPr>
+        <w:pStyle w:val="FirstParagraph"/>
+      </w:pPr>
+      <w:r>
+        <w:t xml:space="preserve">Because Empiria runs entirely in the browser, its only requirement is a current</w:t>
+      </w:r>
+      <w:r>
+        <w:t xml:space="preserve"> </w:t>
+      </w:r>
+      <w:r>
+        <w:t xml:space="preserve">browser: there is no server, and after the initial download—a single static</w:t>
+      </w:r>
+      <w:r>
+        <w:t xml:space="preserve"> </w:t>
+      </w:r>
+      <w:r>
+        <w:t xml:space="preserve">bundle of roughly 0.4 MB (about 130 KB gzipped)—it runs offline. The numerical</w:t>
+      </w:r>
+      <w:r>
+        <w:t xml:space="preserve"> </w:t>
+      </w:r>
+      <w:r>
+        <w:t xml:space="preserve">workload is light. On a contemporary laptop (Apple M4, single-threaded) the</w:t>
+      </w:r>
+      <w:r>
+        <w:t xml:space="preserve"> </w:t>
+      </w:r>
+      <w:r>
+        <w:t xml:space="preserve">engine sustains on the order of 2.6 million ticks per second for a typical</w:t>
+      </w:r>
+      <w:r>
+        <w:t xml:space="preserve"> </w:t>
+      </w:r>
+      <w:r>
+        <w:t xml:space="preserve">few-node patch and tens of thousands per second for a busy canvas of around</w:t>
+      </w:r>
+      <w:r>
+        <w:t xml:space="preserve"> </w:t>
+      </w:r>
+      <w:r>
+        <w:t xml:space="preserve">sixty nodes, with memory in the tens of megabytes; the per-node cost is well</w:t>
+      </w:r>
+      <w:r>
+        <w:t xml:space="preserve"> </w:t>
+      </w:r>
+      <w:r>
+        <w:t xml:space="preserve">under a microsecond and grows linearly with the number of nodes. Because the</w:t>
+      </w:r>
+      <w:r>
+        <w:t xml:space="preserve"> </w:t>
+      </w:r>
+      <w:r>
+        <w:t xml:space="preserve">interactive clock is capped at a few thousand ticks per second, the on-screen</w:t>
+      </w:r>
+      <w:r>
+        <w:t xml:space="preserve"> </w:t>
+      </w:r>
+      <w:r>
+        <w:t xml:space="preserve">frame rate—not the arithmetic—is the limiting factor, which leaves ample</w:t>
+      </w:r>
+      <w:r>
+        <w:t xml:space="preserve"> </w:t>
+      </w:r>
+      <w:r>
+        <w:t xml:space="preserve">headroom on the low-power hardware (Chromebooks, tablets) typical of</w:t>
+      </w:r>
+      <w:r>
+        <w:t xml:space="preserve"> </w:t>
+      </w:r>
+      <w:r>
+        <w:t xml:space="preserve">classrooms. The benchmark is a short script in the repository, so these figures</w:t>
+      </w:r>
+      <w:r>
+        <w:t xml:space="preserve"> </w:t>
+      </w:r>
+      <w:r>
+        <w:t xml:space="preserve">can be reproduced and checked on any machine.</w:t>
+      </w:r>
+    </w:p>
+    <w:bookmarkEnd w:id="18"/>
+    <w:bookmarkStart w:id="19" w:name="the-module-library"/>
     <w:p>
       <w:pPr>
         <w:pStyle w:val="Heading2"/>
@@ -1416,9 +1565,9 @@
         <w:t xml:space="preserve">the true value.</w:t>
       </w:r>
     </w:p>
-    <w:bookmarkEnd w:id="15"/>
-    <w:bookmarkEnd w:id="16"/>
-    <w:bookmarkStart w:id="17" w:name="pedagogical-rationale"/>
+    <w:bookmarkEnd w:id="19"/>
+    <w:bookmarkEnd w:id="20"/>
+    <w:bookmarkStart w:id="27" w:name="pedagogical-rationale"/>
     <w:p>
       <w:pPr>
         <w:pStyle w:val="Heading1"/>
@@ -1432,13 +1581,19 @@
         <w:pStyle w:val="FirstParagraph"/>
       </w:pPr>
       <w:r>
-        <w:t xml:space="preserve">Empiria’s design rests on three findings from the statistics-education and</w:t>
-      </w:r>
-      <w:r>
-        <w:t xml:space="preserve"> </w:t>
-      </w:r>
-      <w:r>
-        <w:t xml:space="preserve">mathematical-cognition literatures.</w:t>
+        <w:t xml:space="preserve">Empiria’s design draws on established findings from the statistics-education and</w:t>
+      </w:r>
+      <w:r>
+        <w:t xml:space="preserve"> </w:t>
+      </w:r>
+      <w:r>
+        <w:t xml:space="preserve">mathematical-cognition literatures, which it operationalizes through the</w:t>
+      </w:r>
+      <w:r>
+        <w:t xml:space="preserve"> </w:t>
+      </w:r>
+      <w:r>
+        <w:t xml:space="preserve">principles below.</w:t>
       </w:r>
     </w:p>
     <w:p>
@@ -1482,13 +1637,7 @@
         <w:t xml:space="preserve"> </w:t>
       </w:r>
       <w:r>
-        <w:t xml:space="preserve">than those who encounter the same material as static figures (Chance et al.,</w:t>
-      </w:r>
-      <w:r>
-        <w:t xml:space="preserve"> </w:t>
-      </w:r>
-      <w:r>
-        <w:t xml:space="preserve">2004; delMas et al., 2007; Garfield &amp; Ben-Zvi, 2009). Empiria adopts this</w:t>
+        <w:t xml:space="preserve">than those who encounter the same material as static figures (Chance et al., 2004; delMas et al., 2007; Garfield &amp; Ben-Zvi, 2009; for a recent review, Gok &amp; Goldstone, 2024). Empiria adopts this</w:t>
       </w:r>
       <w:r>
         <w:t xml:space="preserve"> </w:t>
@@ -1614,43 +1763,244 @@
           <w:b/>
           <w:bCs/>
         </w:rPr>
-        <w:t xml:space="preserve">Composition makes the inferential workflow visible.</w:t>
-      </w:r>
-      <w:r>
-        <w:t xml:space="preserve"> </w:t>
-      </w:r>
-      <w:r>
-        <w:t xml:space="preserve">Because the output of</w:t>
-      </w:r>
-      <w:r>
-        <w:t xml:space="preserve"> </w:t>
-      </w:r>
-      <w:r>
-        <w:t xml:space="preserve">any module is routable into any other, the data-generating process → sampling →</w:t>
-      </w:r>
-      <w:r>
-        <w:t xml:space="preserve"> </w:t>
-      </w:r>
-      <w:r>
-        <w:t xml:space="preserve">estimation → inference → diagnostics pipeline is a single wired chain rather</w:t>
-      </w:r>
-      <w:r>
-        <w:t xml:space="preserve"> </w:t>
-      </w:r>
-      <w:r>
-        <w:t xml:space="preserve">than a sequence of disconnected applets. This directly targets the structure</w:t>
-      </w:r>
-      <w:r>
-        <w:t xml:space="preserve"> </w:t>
-      </w:r>
-      <w:r>
-        <w:t xml:space="preserve">the reform literature identifies as the learning objective (Cobb, 2007; Tintle</w:t>
-      </w:r>
-      <w:r>
-        <w:t xml:space="preserve"> </w:t>
-      </w:r>
-      <w:r>
-        <w:t xml:space="preserve">et al., 2015).</w:t>
+        <w:t xml:space="preserve">Live notation ties manipulation to symbolic form.</w:t>
+      </w:r>
+      <w:r>
+        <w:t xml:space="preserve"> </w:t>
+      </w:r>
+      <w:r>
+        <w:t xml:space="preserve">A persistent difficulty</w:t>
+      </w:r>
+      <w:r>
+        <w:t xml:space="preserve"> </w:t>
+      </w:r>
+      <w:r>
+        <w:t xml:space="preserve">in statistics is that formulas stay inert: a student can read</w:t>
+      </w:r>
+      <w:r>
+        <w:t xml:space="preserve"> </w:t>
+      </w:r>
+      <w:r>
+        <w:rPr>
+          <w:i/>
+          <w:iCs/>
+        </w:rPr>
+        <w:t xml:space="preserve">t</w:t>
+      </w:r>
+      <w:r>
+        <w:t xml:space="preserve"> </w:t>
+      </w:r>
+      <w:r>
+        <w:t xml:space="preserve">= (x̄ − μ₀)/(s/√n) without connecting any symbol to something they can</w:t>
+      </w:r>
+      <w:r>
+        <w:t xml:space="preserve"> </w:t>
+      </w:r>
+      <w:r>
+        <w:t xml:space="preserve">change. Empiria can render, beneath every node, the formula that node computes</w:t>
+      </w:r>
+      <w:r>
+        <w:t xml:space="preserve"> </w:t>
+      </w:r>
+      <w:r>
+        <w:t xml:space="preserve">in standard mathematical notation, written as a chained equality—the symbolic</w:t>
+      </w:r>
+      <w:r>
+        <w:t xml:space="preserve"> </w:t>
+      </w:r>
+      <w:r>
+        <w:t xml:space="preserve">expression, the current values substituted into it, and the result—and updated</w:t>
+      </w:r>
+      <w:r>
+        <w:t xml:space="preserve"> </w:t>
+      </w:r>
+      <w:r>
+        <w:t xml:space="preserve">on every tick (Figure 2). Manipulating the patch is therefore reflected</w:t>
+      </w:r>
+      <w:r>
+        <w:t xml:space="preserve"> </w:t>
+      </w:r>
+      <w:r>
+        <w:t xml:space="preserve">immediately in the equation: as a sample grows the student watches</w:t>
+      </w:r>
+      <w:r>
+        <w:t xml:space="preserve"> </w:t>
+      </w:r>
+      <w:r>
+        <w:rPr>
+          <w:i/>
+          <w:iCs/>
+        </w:rPr>
+        <w:t xml:space="preserve">s</w:t>
+      </w:r>
+      <w:r>
+        <w:t xml:space="preserve"> </w:t>
+      </w:r>
+      <w:r>
+        <w:t xml:space="preserve">shrink</w:t>
+      </w:r>
+      <w:r>
+        <w:t xml:space="preserve"> </w:t>
+      </w:r>
+      <w:r>
+        <w:t xml:space="preserve">and the denominator</w:t>
+      </w:r>
+      <w:r>
+        <w:t xml:space="preserve"> </w:t>
+      </w:r>
+      <w:r>
+        <w:rPr>
+          <w:i/>
+          <w:iCs/>
+        </w:rPr>
+        <w:t xml:space="preserve">s</w:t>
+      </w:r>
+      <w:r>
+        <w:t xml:space="preserve">/√</w:t>
+      </w:r>
+      <w:r>
+        <w:rPr>
+          <w:i/>
+          <w:iCs/>
+        </w:rPr>
+        <w:t xml:space="preserve">n</w:t>
+      </w:r>
+      <w:r>
+        <w:t xml:space="preserve"> </w:t>
+      </w:r>
+      <w:r>
+        <w:t xml:space="preserve">shrink with it; widening the gap x̄ − μ₀ drives the</w:t>
+      </w:r>
+      <w:r>
+        <w:t xml:space="preserve"> </w:t>
+      </w:r>
+      <w:r>
+        <w:rPr>
+          <w:i/>
+          <w:iCs/>
+        </w:rPr>
+        <w:t xml:space="preserve">t</w:t>
+      </w:r>
+      <w:r>
+        <w:t xml:space="preserve">-statistic up; a Transform node shows</w:t>
+      </w:r>
+      <w:r>
+        <w:t xml:space="preserve"> </w:t>
+      </w:r>
+      <w:r>
+        <w:rPr>
+          <w:i/>
+          <w:iCs/>
+        </w:rPr>
+        <w:t xml:space="preserve">y</w:t>
+      </w:r>
+      <w:r>
+        <w:t xml:space="preserve"> </w:t>
+      </w:r>
+      <w:r>
+        <w:t xml:space="preserve">= 2·</w:t>
+      </w:r>
+      <w:r>
+        <w:rPr>
+          <w:i/>
+          <w:iCs/>
+        </w:rPr>
+        <w:t xml:space="preserve">x</w:t>
+      </w:r>
+      <w:r>
+        <w:t xml:space="preserve"> </w:t>
+      </w:r>
+      <w:r>
+        <w:t xml:space="preserve">+ 1 evaluating a specific</w:t>
+      </w:r>
+      <w:r>
+        <w:t xml:space="preserve"> </w:t>
+      </w:r>
+      <w:r>
+        <w:t xml:space="preserve">input to a specific output beside the scatter it produces. The same patch can</w:t>
+      </w:r>
+      <w:r>
+        <w:t xml:space="preserve"> </w:t>
+      </w:r>
+      <w:r>
+        <w:t xml:space="preserve">thus be read two ways at once—picture-first for intuition and notation-first for</w:t>
+      </w:r>
+      <w:r>
+        <w:t xml:space="preserve"> </w:t>
+      </w:r>
+      <w:r>
+        <w:t xml:space="preserve">formalism—so the symbolic layer becomes a manipulable object rather than a</w:t>
+      </w:r>
+      <w:r>
+        <w:t xml:space="preserve"> </w:t>
+      </w:r>
+      <w:r>
+        <w:t xml:space="preserve">static artifact, which directly addresses the symbol-grounding gap the</w:t>
+      </w:r>
+      <w:r>
+        <w:t xml:space="preserve"> </w:t>
+      </w:r>
+      <w:r>
+        <w:t xml:space="preserve">concrete-to-abstract literature identifies. Because the notation is rendered</w:t>
+      </w:r>
+      <w:r>
+        <w:t xml:space="preserve"> </w:t>
+      </w:r>
+      <w:r>
+        <w:t xml:space="preserve">with the browser’s native MathML, the feature adds no dependency and no</w:t>
+      </w:r>
+      <w:r>
+        <w:t xml:space="preserve"> </w:t>
+      </w:r>
+      <w:r>
+        <w:t xml:space="preserve">meaningful weight.</w:t>
+      </w:r>
+    </w:p>
+    <w:p>
+      <w:pPr>
+        <w:pStyle w:val="BodyText"/>
+      </w:pPr>
+      <w:r>
+        <w:drawing>
+          <wp:inline>
+            <wp:extent cx="5334000" cy="3294529"/>
+            <wp:effectExtent b="0" l="0" r="0" t="0"/>
+            <wp:docPr descr="The live-notation view: each node’s formula with current values substituted" title="" id="22" name="Picture"/>
+            <a:graphic>
+              <a:graphicData uri="http://schemas.openxmlformats.org/drawingml/2006/picture">
+                <pic:pic>
+                  <pic:nvPicPr>
+                    <pic:cNvPr descr="submission/figures/formulas.png" id="23" name="Picture"/>
+                    <pic:cNvPicPr>
+                      <a:picLocks noChangeArrowheads="1" noChangeAspect="1"/>
+                    </pic:cNvPicPr>
+                  </pic:nvPicPr>
+                  <pic:blipFill>
+                    <a:blip r:embed="rId21"/>
+                    <a:stretch>
+                      <a:fillRect/>
+                    </a:stretch>
+                  </pic:blipFill>
+                  <pic:spPr bwMode="auto">
+                    <a:xfrm>
+                      <a:off x="0" y="0"/>
+                      <a:ext cx="5334000" cy="3294529"/>
+                    </a:xfrm>
+                    <a:prstGeom prst="rect">
+                      <a:avLst/>
+                    </a:prstGeom>
+                    <a:noFill/>
+                    <a:ln w="9525">
+                      <a:noFill/>
+                      <a:headEnd/>
+                      <a:tailEnd/>
+                    </a:ln>
+                  </pic:spPr>
+                </pic:pic>
+              </a:graphicData>
+            </a:graphic>
+          </wp:inline>
+        </w:drawing>
       </w:r>
     </w:p>
     <w:p>
@@ -1662,6 +2012,163 @@
           <w:b/>
           <w:bCs/>
         </w:rPr>
+        <w:t xml:space="preserve">Figure 2.</w:t>
+      </w:r>
+      <w:r>
+        <w:t xml:space="preserve"> </w:t>
+      </w:r>
+      <w:r>
+        <w:t xml:space="preserve">The live-notation view (toggled on). Beneath each node, the</w:t>
+      </w:r>
+      <w:r>
+        <w:t xml:space="preserve"> </w:t>
+      </w:r>
+      <w:r>
+        <w:t xml:space="preserve">formula it computes is rendered in standard notation with the current values</w:t>
+      </w:r>
+      <w:r>
+        <w:t xml:space="preserve"> </w:t>
+      </w:r>
+      <w:r>
+        <w:t xml:space="preserve">substituted in: the Sample node shows its data-generating distribution and</w:t>
+      </w:r>
+      <w:r>
+        <w:t xml:space="preserve"> </w:t>
+      </w:r>
+      <w:r>
+        <w:t xml:space="preserve">running estimates, the Transform node shows</w:t>
+      </w:r>
+      <w:r>
+        <w:t xml:space="preserve"> </w:t>
+      </w:r>
+      <w:r>
+        <w:rPr>
+          <w:i/>
+          <w:iCs/>
+        </w:rPr>
+        <w:t xml:space="preserve">y</w:t>
+      </w:r>
+      <w:r>
+        <w:t xml:space="preserve"> </w:t>
+      </w:r>
+      <w:r>
+        <w:t xml:space="preserve">= 2·</w:t>
+      </w:r>
+      <w:r>
+        <w:rPr>
+          <w:i/>
+          <w:iCs/>
+        </w:rPr>
+        <w:t xml:space="preserve">x</w:t>
+      </w:r>
+      <w:r>
+        <w:t xml:space="preserve"> </w:t>
+      </w:r>
+      <w:r>
+        <w:t xml:space="preserve">+ 1 evaluated at a</w:t>
+      </w:r>
+      <w:r>
+        <w:t xml:space="preserve"> </w:t>
+      </w:r>
+      <w:r>
+        <w:t xml:space="preserve">specific input, the Noise node shows</w:t>
+      </w:r>
+      <w:r>
+        <w:t xml:space="preserve"> </w:t>
+      </w:r>
+      <w:r>
+        <w:rPr>
+          <w:i/>
+          <w:iCs/>
+        </w:rPr>
+        <w:t xml:space="preserve">y</w:t>
+      </w:r>
+      <w:r>
+        <w:t xml:space="preserve"> </w:t>
+      </w:r>
+      <w:r>
+        <w:t xml:space="preserve">=</w:t>
+      </w:r>
+      <w:r>
+        <w:t xml:space="preserve"> </w:t>
+      </w:r>
+      <w:r>
+        <w:rPr>
+          <w:i/>
+          <w:iCs/>
+        </w:rPr>
+        <w:t xml:space="preserve">x</w:t>
+      </w:r>
+      <w:r>
+        <w:t xml:space="preserve"> </w:t>
+      </w:r>
+      <w:r>
+        <w:t xml:space="preserve">+ ε with ε ∼ N(0, σ²), and the</w:t>
+      </w:r>
+      <w:r>
+        <w:t xml:space="preserve"> </w:t>
+      </w:r>
+      <w:r>
+        <w:t xml:space="preserve">Regress node reports the recovered ŷ = a + b·x and R². As the user changes a</w:t>
+      </w:r>
+      <w:r>
+        <w:t xml:space="preserve"> </w:t>
+      </w:r>
+      <w:r>
+        <w:t xml:space="preserve">parameter or rewires the graph, every equation updates on the next tick.</w:t>
+      </w:r>
+    </w:p>
+    <w:p>
+      <w:pPr>
+        <w:pStyle w:val="BodyText"/>
+      </w:pPr>
+      <w:r>
+        <w:rPr>
+          <w:b/>
+          <w:bCs/>
+        </w:rPr>
+        <w:t xml:space="preserve">Composition makes the inferential workflow visible.</w:t>
+      </w:r>
+      <w:r>
+        <w:t xml:space="preserve"> </w:t>
+      </w:r>
+      <w:r>
+        <w:t xml:space="preserve">Because the output of</w:t>
+      </w:r>
+      <w:r>
+        <w:t xml:space="preserve"> </w:t>
+      </w:r>
+      <w:r>
+        <w:t xml:space="preserve">any module is routable into any other, the data-generating process → sampling →</w:t>
+      </w:r>
+      <w:r>
+        <w:t xml:space="preserve"> </w:t>
+      </w:r>
+      <w:r>
+        <w:t xml:space="preserve">estimation → inference → diagnostics pipeline is a single wired chain rather</w:t>
+      </w:r>
+      <w:r>
+        <w:t xml:space="preserve"> </w:t>
+      </w:r>
+      <w:r>
+        <w:t xml:space="preserve">than a sequence of disconnected applets. This directly targets the structure</w:t>
+      </w:r>
+      <w:r>
+        <w:t xml:space="preserve"> </w:t>
+      </w:r>
+      <w:r>
+        <w:t xml:space="preserve">the reform literature identifies as the learning objective (Cobb, 2007; Tintle et al., 2015).</w:t>
+      </w:r>
+    </w:p>
+    <w:p>
+      <w:pPr>
+        <w:pStyle w:val="BodyText"/>
+      </w:pPr>
+      <w:r>
+        <w:rPr>
+          <w:b/>
+          <w:bCs/>
+        </w:rPr>
         <w:t xml:space="preserve">Modular composition invites customization and independent exploration.</w:t>
       </w:r>
       <w:r>
@@ -1692,19 +2199,13 @@
         <w:t xml:space="preserve"> </w:t>
       </w:r>
       <w:r>
-        <w:t xml:space="preserve">something the instructor never specified built from scratch. This open-ended,</w:t>
-      </w:r>
-      <w:r>
-        <w:t xml:space="preserve"> </w:t>
-      </w:r>
-      <w:r>
-        <w:t xml:space="preserve">constructionist mode—understanding by building and tinkering (Papert,</w:t>
-      </w:r>
-      <w:r>
-        <w:t xml:space="preserve"> </w:t>
-      </w:r>
-      <w:r>
-        <w:t xml:space="preserve">1980)—is supported directly by the dataflow canvas and by the analog-computing</w:t>
+        <w:t xml:space="preserve">something the instructor never specified built from scratch (Figure 3). This open-ended,</w:t>
+      </w:r>
+      <w:r>
+        <w:t xml:space="preserve"> </w:t>
+      </w:r>
+      <w:r>
+        <w:t xml:space="preserve">constructionist mode—understanding by building and tinkering (Papert, 1980)—is supported directly by the dataflow canvas and by the analog-computing</w:t>
       </w:r>
       <w:r>
         <w:t xml:space="preserve"> </w:t>
@@ -1736,6 +2237,116 @@
         <w:pStyle w:val="BodyText"/>
       </w:pPr>
       <w:r>
+        <w:drawing>
+          <wp:inline>
+            <wp:extent cx="5334000" cy="3294529"/>
+            <wp:effectExtent b="0" l="0" r="0" t="0"/>
+            <wp:docPr descr="Building a data-generating process from interchangeable parts" title="" id="25" name="Picture"/>
+            <a:graphic>
+              <a:graphicData uri="http://schemas.openxmlformats.org/drawingml/2006/picture">
+                <pic:pic>
+                  <pic:nvPicPr>
+                    <pic:cNvPr descr="submission/figures/realfit.png" id="26" name="Picture"/>
+                    <pic:cNvPicPr>
+                      <a:picLocks noChangeArrowheads="1" noChangeAspect="1"/>
+                    </pic:cNvPicPr>
+                  </pic:nvPicPr>
+                  <pic:blipFill>
+                    <a:blip r:embed="rId24"/>
+                    <a:stretch>
+                      <a:fillRect/>
+                    </a:stretch>
+                  </pic:blipFill>
+                  <pic:spPr bwMode="auto">
+                    <a:xfrm>
+                      <a:off x="0" y="0"/>
+                      <a:ext cx="5334000" cy="3294529"/>
+                    </a:xfrm>
+                    <a:prstGeom prst="rect">
+                      <a:avLst/>
+                    </a:prstGeom>
+                    <a:noFill/>
+                    <a:ln w="9525">
+                      <a:noFill/>
+                      <a:headEnd/>
+                      <a:tailEnd/>
+                    </a:ln>
+                  </pic:spPr>
+                </pic:pic>
+              </a:graphicData>
+            </a:graphic>
+          </wp:inline>
+        </w:drawing>
+      </w:r>
+    </w:p>
+    <w:p>
+      <w:pPr>
+        <w:pStyle w:val="BodyText"/>
+      </w:pPr>
+      <w:r>
+        <w:rPr>
+          <w:b/>
+          <w:bCs/>
+        </w:rPr>
+        <w:t xml:space="preserve">Figure 3.</w:t>
+      </w:r>
+      <w:r>
+        <w:t xml:space="preserve"> </w:t>
+      </w:r>
+      <w:r>
+        <w:t xml:space="preserve">Building a data-generating process from interchangeable parts. A uniform predictor (Sample) is passed through a deterministic Transform (</w:t>
+      </w:r>
+      <m:oMath>
+        <m:r>
+          <m:t>y</m:t>
+        </m:r>
+        <m:r>
+          <m:rPr>
+            <m:sty m:val="p"/>
+          </m:rPr>
+          <m:t>=</m:t>
+        </m:r>
+        <m:r>
+          <m:t>2</m:t>
+        </m:r>
+        <m:r>
+          <m:t>x</m:t>
+        </m:r>
+        <m:r>
+          <m:rPr>
+            <m:sty m:val="p"/>
+          </m:rPr>
+          <m:t>+</m:t>
+        </m:r>
+        <m:r>
+          <m:t>1</m:t>
+        </m:r>
+      </m:oMath>
+      <w:r>
+        <w:t xml:space="preserve">) and a Noise module before a Regress node recovers the relationship online and reports the fitted slope and intercept. Because the model is</w:t>
+      </w:r>
+      <w:r>
+        <w:t xml:space="preserve"> </w:t>
+      </w:r>
+      <w:r>
+        <w:rPr>
+          <w:i/>
+          <w:iCs/>
+        </w:rPr>
+        <w:t xml:space="preserve">assembled</w:t>
+      </w:r>
+      <w:r>
+        <w:t xml:space="preserve"> </w:t>
+      </w:r>
+      <w:r>
+        <w:t xml:space="preserve">rather than scripted, a student can swap the transform, change the amount of noise, or rewire the graph and watch every downstream view update—the build-and-tinker, analog-computing mode of working the design is meant to invite.</w:t>
+      </w:r>
+    </w:p>
+    <w:p>
+      <w:pPr>
+        <w:pStyle w:val="BodyText"/>
+      </w:pPr>
+      <w:r>
         <w:t xml:space="preserve">These principles are operationalized in sixteen bundled lessons, each a</w:t>
       </w:r>
       <w:r>
@@ -1828,8 +2439,8 @@
         <w:t xml:space="preserve">tool.</w:t>
       </w:r>
     </w:p>
-    <w:bookmarkEnd w:id="17"/>
-    <w:bookmarkStart w:id="18" w:name="illustrative-classroom-use"/>
+    <w:bookmarkEnd w:id="27"/>
+    <w:bookmarkStart w:id="31" w:name="illustrative-classroom-use"/>
     <w:p>
       <w:pPr>
         <w:pStyle w:val="Heading1"/>
@@ -1899,7 +2510,7 @@
         <w:t xml:space="preserve"> </w:t>
       </w:r>
       <w:r>
-        <w:t xml:space="preserve">formula—and reports a bias-corrected and accelerated interval (Efron, 1987). A</w:t>
+        <w:t xml:space="preserve">formula—and reports a bias-corrected and accelerated interval (Efron, 1987; Hesterberg, 2015) (Figure 4). A</w:t>
       </w:r>
       <w:r>
         <w:t xml:space="preserve"> </w:t>
@@ -2051,8 +2662,89 @@
         <w:t xml:space="preserve">confident that every result reproduces.</w:t>
       </w:r>
     </w:p>
-    <w:bookmarkEnd w:id="18"/>
-    <w:bookmarkStart w:id="19" w:name="X0cab4394ba209c841fd4138ca62600fdd5bff89"/>
+    <w:p>
+      <w:pPr>
+        <w:pStyle w:val="BodyText"/>
+      </w:pPr>
+      <w:r>
+        <w:drawing>
+          <wp:inline>
+            <wp:extent cx="5334000" cy="3294529"/>
+            <wp:effectExtent b="0" l="0" r="0" t="0"/>
+            <wp:docPr descr="Simulation made visible: a bootstrap sampling distribution" title="" id="29" name="Picture"/>
+            <a:graphic>
+              <a:graphicData uri="http://schemas.openxmlformats.org/drawingml/2006/picture">
+                <pic:pic>
+                  <pic:nvPicPr>
+                    <pic:cNvPr descr="submission/figures/bootstrap.png" id="30" name="Picture"/>
+                    <pic:cNvPicPr>
+                      <a:picLocks noChangeArrowheads="1" noChangeAspect="1"/>
+                    </pic:cNvPicPr>
+                  </pic:nvPicPr>
+                  <pic:blipFill>
+                    <a:blip r:embed="rId28"/>
+                    <a:stretch>
+                      <a:fillRect/>
+                    </a:stretch>
+                  </pic:blipFill>
+                  <pic:spPr bwMode="auto">
+                    <a:xfrm>
+                      <a:off x="0" y="0"/>
+                      <a:ext cx="5334000" cy="3294529"/>
+                    </a:xfrm>
+                    <a:prstGeom prst="rect">
+                      <a:avLst/>
+                    </a:prstGeom>
+                    <a:noFill/>
+                    <a:ln w="9525">
+                      <a:noFill/>
+                      <a:headEnd/>
+                      <a:tailEnd/>
+                    </a:ln>
+                  </pic:spPr>
+                </pic:pic>
+              </a:graphicData>
+            </a:graphic>
+          </wp:inline>
+        </w:drawing>
+      </w:r>
+    </w:p>
+    <w:p>
+      <w:pPr>
+        <w:pStyle w:val="BodyText"/>
+      </w:pPr>
+      <w:r>
+        <w:rPr>
+          <w:b/>
+          <w:bCs/>
+        </w:rPr>
+        <w:t xml:space="preserve">Figure 4.</w:t>
+      </w:r>
+      <w:r>
+        <w:t xml:space="preserve"> </w:t>
+      </w:r>
+      <w:r>
+        <w:t xml:space="preserve">Simulation made visible. A sample drawn from a skewed (exponential) parent is resampled with replacement by the Boot module, whose histogram (magenta) is the bootstrap sampling distribution of the mean, annotated with a bias-corrected and accelerated interval. The sampling distribution is</w:t>
+      </w:r>
+      <w:r>
+        <w:t xml:space="preserve"> </w:t>
+      </w:r>
+      <w:r>
+        <w:rPr>
+          <w:i/>
+          <w:iCs/>
+        </w:rPr>
+        <w:t xml:space="preserve">constructed</w:t>
+      </w:r>
+      <w:r>
+        <w:t xml:space="preserve"> </w:t>
+      </w:r>
+      <w:r>
+        <w:t xml:space="preserve">empirically and watched as it forms, before any closed-form expression is introduced.</w:t>
+      </w:r>
+    </w:p>
+    <w:bookmarkEnd w:id="31"/>
+    <w:bookmarkStart w:id="34" w:name="X0cab4394ba209c841fd4138ca62600fdd5bff89"/>
     <w:p>
       <w:pPr>
         <w:pStyle w:val="Heading1"/>
@@ -2061,6 +2753,15 @@
         <w:t xml:space="preserve">Numerical correctness and reproducibility</w:t>
       </w:r>
     </w:p>
+    <w:bookmarkStart w:id="32" w:name="verifying-the-numerics"/>
+    <w:p>
+      <w:pPr>
+        <w:pStyle w:val="Heading2"/>
+      </w:pPr>
+      <w:r>
+        <w:t xml:space="preserve">Verifying the numerics</w:t>
+      </w:r>
+    </w:p>
     <w:p>
       <w:pPr>
         <w:pStyle w:val="FirstParagraph"/>
@@ -2292,14 +2993,325 @@
         <w:t xml:space="preserve">export on any machine.</w:t>
       </w:r>
     </w:p>
-    <w:bookmarkEnd w:id="19"/>
-    <w:bookmarkStart w:id="21" w:name="availability"/>
+    <w:bookmarkEnd w:id="32"/>
+    <w:bookmarkStart w:id="33" w:name="development-with-ai-coding-assistance"/>
+    <w:p>
+      <w:pPr>
+        <w:pStyle w:val="Heading2"/>
+      </w:pPr>
+      <w:r>
+        <w:t xml:space="preserve">Development with AI coding assistance</w:t>
+      </w:r>
+    </w:p>
+    <w:p>
+      <w:pPr>
+        <w:pStyle w:val="FirstParagraph"/>
+      </w:pPr>
+      <w:r>
+        <w:t xml:space="preserve">Empiria’s implementation was carried out with the help of AI coding assistants</w:t>
+      </w:r>
+      <w:r>
+        <w:t xml:space="preserve"> </w:t>
+      </w:r>
+      <w:r>
+        <w:t xml:space="preserve">(large language models used as programming aids). We disclose this as a matter</w:t>
+      </w:r>
+      <w:r>
+        <w:t xml:space="preserve"> </w:t>
+      </w:r>
+      <w:r>
+        <w:t xml:space="preserve">of scholarly practice, and because it bears on a legitimate concern: software</w:t>
+      </w:r>
+      <w:r>
+        <w:t xml:space="preserve"> </w:t>
+      </w:r>
+      <w:r>
+        <w:t xml:space="preserve">produced with substantial machine assistance may contain plausible-looking but</w:t>
+      </w:r>
+      <w:r>
+        <w:t xml:space="preserve"> </w:t>
+      </w:r>
+      <w:r>
+        <w:t xml:space="preserve">incorrect numerical behavior, and a reader is right to ask whether the</w:t>
+      </w:r>
+      <w:r>
+        <w:t xml:space="preserve"> </w:t>
+      </w:r>
+      <w:r>
+        <w:t xml:space="preserve">displayed statistics can be trusted. The answer here is methodological rather</w:t>
+      </w:r>
+      <w:r>
+        <w:t xml:space="preserve"> </w:t>
+      </w:r>
+      <w:r>
+        <w:t xml:space="preserve">than rhetorical. The trustworthiness of Empiria’s outputs does not rest on the</w:t>
+      </w:r>
+      <w:r>
+        <w:t xml:space="preserve"> </w:t>
+      </w:r>
+      <w:r>
+        <w:t xml:space="preserve">provenance of the code that produces them; it rests on an external verification</w:t>
+      </w:r>
+      <w:r>
+        <w:t xml:space="preserve"> </w:t>
+      </w:r>
+      <w:r>
+        <w:t xml:space="preserve">regime that is independent of how the code was written.</w:t>
+      </w:r>
+    </w:p>
+    <w:p>
+      <w:pPr>
+        <w:pStyle w:val="BodyText"/>
+      </w:pPr>
+      <w:r>
+        <w:t xml:space="preserve">Concretely, every numerical routine is checked against an authoritative</w:t>
+      </w:r>
+      <w:r>
+        <w:t xml:space="preserve"> </w:t>
+      </w:r>
+      <w:r>
+        <w:t xml:space="preserve">reference implementation—R’s statistical functions (</w:t>
+      </w:r>
+      <w:r>
+        <w:rPr>
+          <w:rStyle w:val="VerbatimChar"/>
+        </w:rPr>
+        <w:t xml:space="preserve">pt</w:t>
+      </w:r>
+      <w:r>
+        <w:t xml:space="preserve">,</w:t>
+      </w:r>
+      <w:r>
+        <w:t xml:space="preserve"> </w:t>
+      </w:r>
+      <w:r>
+        <w:rPr>
+          <w:rStyle w:val="VerbatimChar"/>
+        </w:rPr>
+        <w:t xml:space="preserve">qt</w:t>
+      </w:r>
+      <w:r>
+        <w:t xml:space="preserve">,</w:t>
+      </w:r>
+      <w:r>
+        <w:t xml:space="preserve"> </w:t>
+      </w:r>
+      <w:r>
+        <w:rPr>
+          <w:rStyle w:val="VerbatimChar"/>
+        </w:rPr>
+        <w:t xml:space="preserve">pchisq</w:t>
+      </w:r>
+      <w:r>
+        <w:t xml:space="preserve">,</w:t>
+      </w:r>
+      <w:r>
+        <w:t xml:space="preserve"> </w:t>
+      </w:r>
+      <w:r>
+        <w:rPr>
+          <w:rStyle w:val="VerbatimChar"/>
+        </w:rPr>
+        <w:t xml:space="preserve">pnorm</w:t>
+      </w:r>
+      <w:r>
+        <w:t xml:space="preserve">,</w:t>
+      </w:r>
+      <w:r>
+        <w:t xml:space="preserve"> </w:t>
+      </w:r>
+      <w:r>
+        <w:rPr>
+          <w:rStyle w:val="VerbatimChar"/>
+        </w:rPr>
+        <w:t xml:space="preserve">qnorm</w:t>
+      </w:r>
+      <w:r>
+        <w:t xml:space="preserve">,</w:t>
+      </w:r>
+      <w:r>
+        <w:t xml:space="preserve"> </w:t>
+      </w:r>
+      <w:r>
+        <w:rPr>
+          <w:rStyle w:val="VerbatimChar"/>
+        </w:rPr>
+        <w:t xml:space="preserve">t.test</w:t>
+      </w:r>
+      <w:r>
+        <w:t xml:space="preserve">,</w:t>
+      </w:r>
+      <w:r>
+        <w:t xml:space="preserve"> </w:t>
+      </w:r>
+      <w:r>
+        <w:rPr>
+          <w:rStyle w:val="VerbatimChar"/>
+        </w:rPr>
+        <w:t xml:space="preserve">lm</w:t>
+      </w:r>
+      <w:r>
+        <w:t xml:space="preserve">,</w:t>
+      </w:r>
+      <w:r>
+        <w:t xml:space="preserve"> </w:t>
+      </w:r>
+      <w:r>
+        <w:rPr>
+          <w:rStyle w:val="VerbatimChar"/>
+        </w:rPr>
+        <w:t xml:space="preserve">chisq.test</w:t>
+      </w:r>
+      <w:r>
+        <w:t xml:space="preserve">,</w:t>
+      </w:r>
+      <w:r>
+        <w:t xml:space="preserve"> </w:t>
+      </w:r>
+      <w:r>
+        <w:rPr>
+          <w:rStyle w:val="VerbatimChar"/>
+        </w:rPr>
+        <w:t xml:space="preserve">acf</w:t>
+      </w:r>
+      <w:r>
+        <w:t xml:space="preserve">,</w:t>
+      </w:r>
+      <w:r>
+        <w:t xml:space="preserve"> </w:t>
+      </w:r>
+      <w:r>
+        <w:rPr>
+          <w:rStyle w:val="VerbatimChar"/>
+        </w:rPr>
+        <w:t xml:space="preserve">quantile</w:t>
+      </w:r>
+      <w:r>
+        <w:t xml:space="preserve">), the</w:t>
+      </w:r>
+      <w:r>
+        <w:t xml:space="preserve"> </w:t>
+      </w:r>
+      <w:r>
+        <w:rPr>
+          <w:rStyle w:val="VerbatimChar"/>
+        </w:rPr>
+        <w:t xml:space="preserve">boot</w:t>
+      </w:r>
+      <w:r>
+        <w:t xml:space="preserve"> </w:t>
+      </w:r>
+      <w:r>
+        <w:t xml:space="preserve">package for the BCa interval, and the canonical Mersenne-Twister test</w:t>
+      </w:r>
+      <w:r>
+        <w:t xml:space="preserve"> </w:t>
+      </w:r>
+      <w:r>
+        <w:t xml:space="preserve">vector—to machine precision, with Monte-Carlo tolerances stated explicitly</w:t>
+      </w:r>
+      <w:r>
+        <w:t xml:space="preserve"> </w:t>
+      </w:r>
+      <w:r>
+        <w:t xml:space="preserve">where resampling is involved. Those reference values are produced by an</w:t>
+      </w:r>
+      <w:r>
+        <w:t xml:space="preserve"> </w:t>
+      </w:r>
+      <w:r>
+        <w:t xml:space="preserve">independent R script that a reviewer can rerun and compare against the literals</w:t>
+      </w:r>
+      <w:r>
+        <w:t xml:space="preserve"> </w:t>
+      </w:r>
+      <w:r>
+        <w:t xml:space="preserve">asserted in the test suite, so the check confirms the reference values</w:t>
+      </w:r>
+      <w:r>
+        <w:t xml:space="preserve"> </w:t>
+      </w:r>
+      <w:r>
+        <w:t xml:space="preserve">themselves rather than only the tool’s internal self-consistency. A test that</w:t>
+      </w:r>
+      <w:r>
+        <w:t xml:space="preserve"> </w:t>
+      </w:r>
+      <w:r>
+        <w:t xml:space="preserve">compares to R cannot be satisfied by code that is merely persuasive: it passes</w:t>
+      </w:r>
+      <w:r>
+        <w:t xml:space="preserve"> </w:t>
+      </w:r>
+      <w:r>
+        <w:t xml:space="preserve">only if the number is right, whoever or whatever wrote the code.</w:t>
+      </w:r>
+    </w:p>
+    <w:p>
+      <w:pPr>
+        <w:pStyle w:val="BodyText"/>
+      </w:pPr>
+      <w:r>
+        <w:t xml:space="preserve">We also separate authorship from correctness. The statistical methods, the</w:t>
+      </w:r>
+      <w:r>
+        <w:t xml:space="preserve"> </w:t>
+      </w:r>
+      <w:r>
+        <w:t xml:space="preserve">choice of exact recipes over normal-theory approximations, the pedagogical</w:t>
+      </w:r>
+      <w:r>
+        <w:t xml:space="preserve"> </w:t>
+      </w:r>
+      <w:r>
+        <w:t xml:space="preserve">claims, and the interpretation of every result were specified, reviewed, and</w:t>
+      </w:r>
+      <w:r>
+        <w:t xml:space="preserve"> </w:t>
+      </w:r>
+      <w:r>
+        <w:t xml:space="preserve">are vouched for by the author; the AI tools accelerated implementation, they did</w:t>
+      </w:r>
+      <w:r>
+        <w:t xml:space="preserve"> </w:t>
+      </w:r>
+      <w:r>
+        <w:t xml:space="preserve">not make statistical decisions, and the author takes full responsibility for</w:t>
+      </w:r>
+      <w:r>
+        <w:t xml:space="preserve"> </w:t>
+      </w:r>
+      <w:r>
+        <w:t xml:space="preserve">the software and the manuscript. Because the full audit trail maps each routine</w:t>
+      </w:r>
+      <w:r>
+        <w:t xml:space="preserve"> </w:t>
+      </w:r>
+      <w:r>
+        <w:t xml:space="preserve">to its algorithm, citation, reference command, and test, and because the entire</w:t>
+      </w:r>
+      <w:r>
+        <w:t xml:space="preserve"> </w:t>
+      </w:r>
+      <w:r>
+        <w:t xml:space="preserve">suite runs from three commands, any reviewer can reproduce the verification in</w:t>
+      </w:r>
+      <w:r>
+        <w:t xml:space="preserve"> </w:t>
+      </w:r>
+      <w:r>
+        <w:t xml:space="preserve">minutes rather than taking our word for it.</w:t>
+      </w:r>
+    </w:p>
+    <w:bookmarkEnd w:id="33"/>
+    <w:bookmarkEnd w:id="34"/>
+    <w:bookmarkStart w:id="36" w:name="data-and-code-availability"/>
     <w:p>
       <w:pPr>
         <w:pStyle w:val="Heading1"/>
       </w:pPr>
       <w:r>
-        <w:t xml:space="preserve">Availability</w:t>
+        <w:t xml:space="preserve">Data and code availability</w:t>
       </w:r>
     </w:p>
     <w:p>
@@ -2307,19 +3319,13 @@
         <w:pStyle w:val="FirstParagraph"/>
       </w:pPr>
       <w:r>
-        <w:t xml:space="preserve">Empiria is released under the GPL-3.0 license. It runs in any modern browser</w:t>
-      </w:r>
-      <w:r>
-        <w:t xml:space="preserve"> </w:t>
-      </w:r>
-      <w:r>
-        <w:t xml:space="preserve">with no installation, on laptops, tablets, and Chromebooks alike, and builds to</w:t>
-      </w:r>
-      <w:r>
-        <w:t xml:space="preserve"> </w:t>
-      </w:r>
-      <w:r>
-        <w:t xml:space="preserve">a static site. The live application is at</w:t>
+        <w:t xml:space="preserve">Empiria is released under the GPL-3.0 license and runs in any modern browser</w:t>
+      </w:r>
+      <w:r>
+        <w:t xml:space="preserve"> </w:t>
+      </w:r>
+      <w:r>
+        <w:t xml:space="preserve">with no installation. The live application is at</w:t>
       </w:r>
       <w:r>
         <w:t xml:space="preserve"> </w:t>
@@ -2333,24 +3339,24 @@
         </w:r>
       </w:hyperlink>
       <w:r>
-        <w:t xml:space="preserve">;</w:t>
-      </w:r>
-      <w:r>
-        <w:t xml:space="preserve"> </w:t>
-      </w:r>
-      <w:r>
-        <w:t xml:space="preserve">the source code, the test suite, the verification materials, the bundled</w:t>
-      </w:r>
-      <w:r>
-        <w:t xml:space="preserve"> </w:t>
-      </w:r>
-      <w:r>
-        <w:t xml:space="preserve">lessons, and the documentation are in the public repository at</w:t>
-      </w:r>
-      <w:r>
-        <w:t xml:space="preserve"> </w:t>
-      </w:r>
-      <w:hyperlink r:id="rId20">
+        <w:t xml:space="preserve">; the source code, the automated test</w:t>
+      </w:r>
+      <w:r>
+        <w:t xml:space="preserve"> </w:t>
+      </w:r>
+      <w:r>
+        <w:t xml:space="preserve">suite, the verification materials, the bundled lessons, and the documentation</w:t>
+      </w:r>
+      <w:r>
+        <w:t xml:space="preserve"> </w:t>
+      </w:r>
+      <w:r>
+        <w:t xml:space="preserve">are in the public repository at</w:t>
+      </w:r>
+      <w:r>
+        <w:t xml:space="preserve"> </w:t>
+      </w:r>
+      <w:hyperlink r:id="rId35">
         <w:r>
           <w:rPr>
             <w:rStyle w:val="Hyperlink"/>
@@ -2359,11 +3365,41 @@
         </w:r>
       </w:hyperlink>
       <w:r>
-        <w:t xml:space="preserve">.</w:t>
-      </w:r>
-    </w:p>
-    <w:bookmarkEnd w:id="21"/>
-    <w:bookmarkStart w:id="22" w:name="limitations-and-future-work"/>
+        <w:t xml:space="preserve">. The exact</w:t>
+      </w:r>
+      <w:r>
+        <w:t xml:space="preserve"> </w:t>
+      </w:r>
+      <w:r>
+        <w:t xml:space="preserve">version described here is tagged in the repository, and a snapshot of that</w:t>
+      </w:r>
+      <w:r>
+        <w:t xml:space="preserve"> </w:t>
+      </w:r>
+      <w:r>
+        <w:t xml:space="preserve">version will be archived with a permanent DOI (Zenodo) upon acceptance, so that</w:t>
+      </w:r>
+      <w:r>
+        <w:t xml:space="preserve"> </w:t>
+      </w:r>
+      <w:r>
+        <w:t xml:space="preserve">the reviewed software remains citable independently of later development. The</w:t>
+      </w:r>
+      <w:r>
+        <w:t xml:space="preserve"> </w:t>
+      </w:r>
+      <w:r>
+        <w:t xml:space="preserve">figures in this article are screenshots of the running application; the patches</w:t>
+      </w:r>
+      <w:r>
+        <w:t xml:space="preserve"> </w:t>
+      </w:r>
+      <w:r>
+        <w:t xml:space="preserve">that generate them are included among the bundled lessons.</w:t>
+      </w:r>
+    </w:p>
+    <w:bookmarkEnd w:id="36"/>
+    <w:bookmarkStart w:id="37" w:name="limitations-and-future-work"/>
     <w:p>
       <w:pPr>
         <w:pStyle w:val="Heading1"/>
@@ -2389,49 +3425,37 @@
         <w:t xml:space="preserve"> </w:t>
       </w:r>
       <w:r>
-        <w:t xml:space="preserve">reasoning, paired with auditable numerics and frictionless, reproducible</w:t>
-      </w:r>
-      <w:r>
-        <w:t xml:space="preserve"> </w:t>
-      </w:r>
-      <w:r>
-        <w:t xml:space="preserve">sharing. Its defining affordances—visual, analog-computing-inspired, and</w:t>
-      </w:r>
-      <w:r>
-        <w:t xml:space="preserve"> </w:t>
-      </w:r>
-      <w:r>
-        <w:t xml:space="preserve">modular—are intended to support not only guided activities but also the kind of</w:t>
-      </w:r>
-      <w:r>
-        <w:t xml:space="preserve"> </w:t>
-      </w:r>
-      <w:r>
-        <w:t xml:space="preserve">open-ended, learner-directed exploration in which a student customizes a patch,</w:t>
-      </w:r>
-      <w:r>
-        <w:t xml:space="preserve"> </w:t>
-      </w:r>
-      <w:r>
-        <w:t xml:space="preserve">substitutes one component for another, and discovers a result by building and</w:t>
-      </w:r>
-      <w:r>
-        <w:t xml:space="preserve"> </w:t>
-      </w:r>
-      <w:r>
-        <w:t xml:space="preserve">tinkering rather than by following a script. These affordances are the basis on</w:t>
-      </w:r>
-      <w:r>
-        <w:t xml:space="preserve"> </w:t>
-      </w:r>
-      <w:r>
-        <w:t xml:space="preserve">which we expect the tool to be useful, and they are available to instructors</w:t>
-      </w:r>
-      <w:r>
-        <w:t xml:space="preserve"> </w:t>
-      </w:r>
-      <w:r>
-        <w:t xml:space="preserve">and students today.</w:t>
+        <w:t xml:space="preserve">reasoning, paired with auditable numerics and reproducible, shareable patches.</w:t>
+      </w:r>
+      <w:r>
+        <w:t xml:space="preserve"> </w:t>
+      </w:r>
+      <w:r>
+        <w:t xml:space="preserve">Its defining affordances are visual, analog-computing-inspired, and modular, and</w:t>
+      </w:r>
+      <w:r>
+        <w:t xml:space="preserve"> </w:t>
+      </w:r>
+      <w:r>
+        <w:t xml:space="preserve">they are intended to support guided activities as well as the open-ended,</w:t>
+      </w:r>
+      <w:r>
+        <w:t xml:space="preserve"> </w:t>
+      </w:r>
+      <w:r>
+        <w:t xml:space="preserve">learner-directed exploration in which a student customizes a patch, substitutes</w:t>
+      </w:r>
+      <w:r>
+        <w:t xml:space="preserve"> </w:t>
+      </w:r>
+      <w:r>
+        <w:t xml:space="preserve">one component for another, and reaches a result by building rather than by</w:t>
+      </w:r>
+      <w:r>
+        <w:t xml:space="preserve"> </w:t>
+      </w:r>
+      <w:r>
+        <w:t xml:space="preserve">following a script.</w:t>
       </w:r>
     </w:p>
     <w:p>
@@ -2439,6 +3463,68 @@
         <w:pStyle w:val="BodyText"/>
       </w:pPr>
       <w:r>
+        <w:t xml:space="preserve">We should be explicit about what this article does not establish. It offers no</w:t>
+      </w:r>
+      <w:r>
+        <w:t xml:space="preserve"> </w:t>
+      </w:r>
+      <w:r>
+        <w:t xml:space="preserve">evidence of learning gains from Empiria itself: the pedagogical claims above are</w:t>
+      </w:r>
+      <w:r>
+        <w:t xml:space="preserve"> </w:t>
+      </w:r>
+      <w:r>
+        <w:t xml:space="preserve">design rationale, grounded in prior findings about related tools, and whether</w:t>
+      </w:r>
+      <w:r>
+        <w:t xml:space="preserve"> </w:t>
+      </w:r>
+      <w:r>
+        <w:t xml:space="preserve">they translate into measurable outcomes is an open empirical question. Reviews</w:t>
+      </w:r>
+      <w:r>
+        <w:t xml:space="preserve"> </w:t>
+      </w:r>
+      <w:r>
+        <w:t xml:space="preserve">of simulation tools are a useful corrective here: interactive visualization</w:t>
+      </w:r>
+      <w:r>
+        <w:t xml:space="preserve"> </w:t>
+      </w:r>
+      <w:r>
+        <w:t xml:space="preserve">does not by itself guarantee understanding—students can watch a sampling</w:t>
+      </w:r>
+      <w:r>
+        <w:t xml:space="preserve"> </w:t>
+      </w:r>
+      <w:r>
+        <w:t xml:space="preserve">distribution narrow and still misread it as a distribution of individual</w:t>
+      </w:r>
+      <w:r>
+        <w:t xml:space="preserve"> </w:t>
+      </w:r>
+      <w:r>
+        <w:t xml:space="preserve">values—so the surrounding tasks and design details do much of the work (Gok &amp;</w:t>
+      </w:r>
+      <w:r>
+        <w:t xml:space="preserve"> </w:t>
+      </w:r>
+      <w:r>
+        <w:t xml:space="preserve">Goldstone, 2024). The affordances are available to instructors and students</w:t>
+      </w:r>
+      <w:r>
+        <w:t xml:space="preserve"> </w:t>
+      </w:r>
+      <w:r>
+        <w:t xml:space="preserve">today, but their educational value remains to be demonstrated.</w:t>
+      </w:r>
+    </w:p>
+    <w:p>
+      <w:pPr>
+        <w:pStyle w:val="BodyText"/>
+      </w:pPr>
+      <w:r>
         <w:t xml:space="preserve">A formal study of classroom learning outcomes is the natural next step, and one</w:t>
       </w:r>
       <w:r>
@@ -2475,7 +3561,19 @@
         <w:t xml:space="preserve"> </w:t>
       </w:r>
       <w:r>
-        <w:t xml:space="preserve">outcomes—to test whether these affordances translate into measurable gains.</w:t>
+        <w:t xml:space="preserve">outcomes, to test whether these affordances translate into measurable gains.</w:t>
+      </w:r>
+      <w:r>
+        <w:t xml:space="preserve"> </w:t>
+      </w:r>
+      <w:r>
+        <w:t xml:space="preserve">That study will be pre-registered, with its hypotheses and analysis plan</w:t>
+      </w:r>
+      <w:r>
+        <w:t xml:space="preserve"> </w:t>
+      </w:r>
+      <w:r>
+        <w:t xml:space="preserve">deposited before any data are collected.</w:t>
       </w:r>
     </w:p>
     <w:p>
@@ -2540,8 +3638,8 @@
         <w:t xml:space="preserve">implementation.</w:t>
       </w:r>
     </w:p>
-    <w:bookmarkEnd w:id="22"/>
-    <w:bookmarkStart w:id="23" w:name="conclusion"/>
+    <w:bookmarkEnd w:id="37"/>
+    <w:bookmarkStart w:id="38" w:name="conclusion"/>
     <w:p>
       <w:pPr>
         <w:pStyle w:val="Heading1"/>
@@ -2579,29 +3677,29 @@
         <w:t xml:space="preserve"> </w:t>
       </w:r>
       <w:r>
-        <w:t xml:space="preserve">model with exact, independently auditable numerics and frictionless,</w:t>
-      </w:r>
-      <w:r>
-        <w:t xml:space="preserve"> </w:t>
-      </w:r>
-      <w:r>
-        <w:t xml:space="preserve">reproducible sharing, it aims to be trustworthy as well as legible: a tool a</w:t>
-      </w:r>
-      <w:r>
-        <w:t xml:space="preserve"> </w:t>
-      </w:r>
-      <w:r>
-        <w:t xml:space="preserve">student can learn from and an instructor can verify.</w:t>
-      </w:r>
-    </w:p>
-    <w:bookmarkEnd w:id="23"/>
-    <w:bookmarkStart w:id="24" w:name="acknowledgements"/>
+        <w:t xml:space="preserve">model with exact, independently auditable numerics and reproducible, shareable</w:t>
+      </w:r>
+      <w:r>
+        <w:t xml:space="preserve"> </w:t>
+      </w:r>
+      <w:r>
+        <w:t xml:space="preserve">patches, it aims to be trustworthy as well as legible: a tool a student can</w:t>
+      </w:r>
+      <w:r>
+        <w:t xml:space="preserve"> </w:t>
+      </w:r>
+      <w:r>
+        <w:t xml:space="preserve">learn from and an instructor can verify.</w:t>
+      </w:r>
+    </w:p>
+    <w:bookmarkEnd w:id="38"/>
+    <w:bookmarkStart w:id="39" w:name="disclosure-statement"/>
     <w:p>
       <w:pPr>
         <w:pStyle w:val="Heading1"/>
       </w:pPr>
       <w:r>
-        <w:t xml:space="preserve">Acknowledgements</w:t>
+        <w:t xml:space="preserve">Disclosure statement</w:t>
       </w:r>
     </w:p>
     <w:p>
@@ -2609,67 +3707,95 @@
         <w:pStyle w:val="FirstParagraph"/>
       </w:pPr>
       <w:r>
-        <w:t xml:space="preserve">The author thanks the open-source scientific-computing and statistics-education</w:t>
-      </w:r>
-      <w:r>
-        <w:t xml:space="preserve"> </w:t>
-      </w:r>
-      <w:r>
-        <w:t xml:space="preserve">communities whose tools and findings shaped this work.</w:t>
-      </w:r>
-    </w:p>
-    <w:bookmarkEnd w:id="24"/>
-    <w:bookmarkStart w:id="25" w:name="disclosure-statement"/>
+        <w:t xml:space="preserve">The author reports no competing interests. No funding supported this work.</w:t>
+      </w:r>
+      <w:r>
+        <w:t xml:space="preserve"> </w:t>
+      </w:r>
+      <w:r>
+        <w:t xml:space="preserve">AI-based coding assistants (large language models) were used as programming</w:t>
+      </w:r>
+      <w:r>
+        <w:t xml:space="preserve"> </w:t>
+      </w:r>
+      <w:r>
+        <w:t xml:space="preserve">aids during development of the software. All statistical methods and numerical</w:t>
+      </w:r>
+      <w:r>
+        <w:t xml:space="preserve"> </w:t>
+      </w:r>
+      <w:r>
+        <w:t xml:space="preserve">results were specified by the author and verified against independent reference</w:t>
+      </w:r>
+      <w:r>
+        <w:t xml:space="preserve"> </w:t>
+      </w:r>
+      <w:r>
+        <w:t xml:space="preserve">implementations, as described in</w:t>
+      </w:r>
+      <w:r>
+        <w:t xml:space="preserve"> </w:t>
+      </w:r>
+      <w:r>
+        <w:rPr>
+          <w:i/>
+          <w:iCs/>
+        </w:rPr>
+        <w:t xml:space="preserve">Numerical correctness and reproducibility</w:t>
+      </w:r>
+      <w:r>
+        <w:t xml:space="preserve">;</w:t>
+      </w:r>
+      <w:r>
+        <w:t xml:space="preserve"> </w:t>
+      </w:r>
+      <w:r>
+        <w:t xml:space="preserve">the author takes full responsibility for the content of the software and the</w:t>
+      </w:r>
+      <w:r>
+        <w:t xml:space="preserve"> </w:t>
+      </w:r>
+      <w:r>
+        <w:t xml:space="preserve">manuscript.</w:t>
+      </w:r>
+    </w:p>
+    <w:bookmarkEnd w:id="39"/>
+    <w:bookmarkStart w:id="54" w:name="references"/>
     <w:p>
       <w:pPr>
         <w:pStyle w:val="Heading1"/>
       </w:pPr>
       <w:r>
-        <w:t xml:space="preserve">Disclosure statement</w:t>
-      </w:r>
-    </w:p>
-    <w:p>
-      <w:pPr>
-        <w:pStyle w:val="FirstParagraph"/>
-      </w:pPr>
-      <w:r>
-        <w:t xml:space="preserve">The author reports no competing interests. No funding supported this work.</w:t>
-      </w:r>
-    </w:p>
-    <w:bookmarkEnd w:id="25"/>
-    <w:bookmarkStart w:id="36" w:name="references"/>
-    <w:p>
-      <w:pPr>
-        <w:pStyle w:val="Heading1"/>
-      </w:pPr>
-      <w:r>
         <w:t xml:space="preserve">References</w:t>
       </w:r>
     </w:p>
     <w:p>
       <w:pPr>
-        <w:pStyle w:val="FirstParagraph"/>
-      </w:pPr>
-      <w:r>
-        <w:t xml:space="preserve">American Statistical Association. (2016).</w:t>
-      </w:r>
-      <w:r>
-        <w:t xml:space="preserve"> </w:t>
-      </w:r>
-      <w:r>
-        <w:rPr>
-          <w:i/>
-          <w:iCs/>
-        </w:rPr>
-        <w:t xml:space="preserve">Guidelines for Assessment and Instruction in Statistics Education (GAISE) College Report 2016</w:t>
-      </w:r>
-      <w:r>
-        <w:t xml:space="preserve">. American Statistical Association.</w:t>
-      </w:r>
-      <w:r>
-        <w:t xml:space="preserve"> </w:t>
-      </w:r>
-      <w:hyperlink r:id="rId26">
+        <w:numPr>
+          <w:ilvl w:val="0"/>
+          <w:numId w:val="1001"/>
+        </w:numPr>
+      </w:pPr>
+      <w:r>
+        <w:t xml:space="preserve">American Statistical Association, Guidelines for Assessment and Instruction in Statistics Education (GAISE) College Report 2016,</w:t>
+      </w:r>
+      <w:r>
+        <w:t xml:space="preserve"> </w:t>
+      </w:r>
+      <w:r>
+        <w:rPr>
+          <w:i/>
+          <w:iCs/>
+        </w:rPr>
+        <w:t xml:space="preserve">American Statistical Association</w:t>
+      </w:r>
+      <w:r>
+        <w:t xml:space="preserve">, 2016.</w:t>
+      </w:r>
+      <w:r>
+        <w:t xml:space="preserve"> </w:t>
+      </w:r>
+      <w:hyperlink r:id="rId40">
         <w:r>
           <w:rPr>
             <w:rStyle w:val="Hyperlink"/>
@@ -2680,10 +3806,13 @@
     </w:p>
     <w:p>
       <w:pPr>
-        <w:pStyle w:val="BodyText"/>
-      </w:pPr>
-      <w:r>
-        <w:t xml:space="preserve">Chance, B., delMas, R., &amp; Garfield, J. (2004). Reasoning about sampling distributions. In D. Ben-Zvi &amp; J. Garfield (Eds.),</w:t>
+        <w:numPr>
+          <w:ilvl w:val="0"/>
+          <w:numId w:val="1001"/>
+        </w:numPr>
+      </w:pPr>
+      <w:r>
+        <w:t xml:space="preserve">B. Chance, R. delMas, J. Garfield, Reasoning about sampling distributions, in: D. Ben-Zvi, J. Garfield (Eds.),</w:t>
       </w:r>
       <w:r>
         <w:t xml:space="preserve"> </w:t>
@@ -2696,15 +3825,12 @@
         <w:t xml:space="preserve">The Challenge of Developing Statistical Literacy, Reasoning, and Thinking</w:t>
       </w:r>
       <w:r>
-        <w:t xml:space="preserve"> </w:t>
-      </w:r>
-      <w:r>
-        <w:t xml:space="preserve">(pp. 295–323). Springer.</w:t>
-      </w:r>
-      <w:r>
-        <w:t xml:space="preserve"> </w:t>
-      </w:r>
-      <w:hyperlink r:id="rId27">
+        <w:t xml:space="preserve">, Springer, 2004, pp. 295–323.</w:t>
+      </w:r>
+      <w:r>
+        <w:t xml:space="preserve"> </w:t>
+      </w:r>
+      <w:hyperlink r:id="rId41">
         <w:r>
           <w:rPr>
             <w:rStyle w:val="Hyperlink"/>
@@ -2715,10 +3841,13 @@
     </w:p>
     <w:p>
       <w:pPr>
-        <w:pStyle w:val="BodyText"/>
-      </w:pPr>
-      <w:r>
-        <w:t xml:space="preserve">Cobb, G. W. (2007). The introductory statistics course: A Ptolemaic curriculum?</w:t>
+        <w:numPr>
+          <w:ilvl w:val="0"/>
+          <w:numId w:val="1001"/>
+        </w:numPr>
+      </w:pPr>
+      <w:r>
+        <w:t xml:space="preserve">G. W. Cobb, The introductory statistics course: A Ptolemaic curriculum?,</w:t>
       </w:r>
       <w:r>
         <w:t xml:space="preserve"> </w:t>
@@ -2731,12 +3860,12 @@
         <w:t xml:space="preserve">Technology Innovations in Statistics Education</w:t>
       </w:r>
       <w:r>
-        <w:t xml:space="preserve">, 1(1).</w:t>
-      </w:r>
-      <w:r>
-        <w:t xml:space="preserve"> </w:t>
-      </w:r>
-      <w:hyperlink r:id="rId28">
+        <w:t xml:space="preserve">, 1(2007).</w:t>
+      </w:r>
+      <w:r>
+        <w:t xml:space="preserve"> </w:t>
+      </w:r>
+      <w:hyperlink r:id="rId42">
         <w:r>
           <w:rPr>
             <w:rStyle w:val="Hyperlink"/>
@@ -2747,10 +3876,13 @@
     </w:p>
     <w:p>
       <w:pPr>
-        <w:pStyle w:val="BodyText"/>
-      </w:pPr>
-      <w:r>
-        <w:t xml:space="preserve">delMas, R., Garfield, J., Ooms, A., &amp; Chance, B. (2007). Assessing students’ conceptual understanding after a first course in statistics.</w:t>
+        <w:numPr>
+          <w:ilvl w:val="0"/>
+          <w:numId w:val="1001"/>
+        </w:numPr>
+      </w:pPr>
+      <w:r>
+        <w:t xml:space="preserve">R. delMas, J. Garfield, A. Ooms, B. Chance, Assessing students’ conceptual understanding after a first course in statistics,</w:t>
       </w:r>
       <w:r>
         <w:t xml:space="preserve"> </w:t>
@@ -2763,12 +3895,12 @@
         <w:t xml:space="preserve">Statistics Education Research Journal</w:t>
       </w:r>
       <w:r>
-        <w:t xml:space="preserve">, 6(2), 28–58.</w:t>
-      </w:r>
-      <w:r>
-        <w:t xml:space="preserve"> </w:t>
-      </w:r>
-      <w:hyperlink r:id="rId29">
+        <w:t xml:space="preserve">, 6(2007), 28–58.</w:t>
+      </w:r>
+      <w:r>
+        <w:t xml:space="preserve"> </w:t>
+      </w:r>
+      <w:hyperlink r:id="rId43">
         <w:r>
           <w:rPr>
             <w:rStyle w:val="Hyperlink"/>
@@ -2779,10 +3911,13 @@
     </w:p>
     <w:p>
       <w:pPr>
-        <w:pStyle w:val="BodyText"/>
-      </w:pPr>
-      <w:r>
-        <w:t xml:space="preserve">Efron, B. (1987). Better bootstrap confidence intervals.</w:t>
+        <w:numPr>
+          <w:ilvl w:val="0"/>
+          <w:numId w:val="1001"/>
+        </w:numPr>
+      </w:pPr>
+      <w:r>
+        <w:t xml:space="preserve">B. Efron, Better bootstrap confidence intervals,</w:t>
       </w:r>
       <w:r>
         <w:t xml:space="preserve"> </w:t>
@@ -2795,12 +3930,12 @@
         <w:t xml:space="preserve">Journal of the American Statistical Association</w:t>
       </w:r>
       <w:r>
-        <w:t xml:space="preserve">, 82(397), 171–185.</w:t>
-      </w:r>
-      <w:r>
-        <w:t xml:space="preserve"> </w:t>
-      </w:r>
-      <w:hyperlink r:id="rId30">
+        <w:t xml:space="preserve">, 82(1987), 171–185.</w:t>
+      </w:r>
+      <w:r>
+        <w:t xml:space="preserve"> </w:t>
+      </w:r>
+      <w:hyperlink r:id="rId44">
         <w:r>
           <w:rPr>
             <w:rStyle w:val="Hyperlink"/>
@@ -2811,10 +3946,13 @@
     </w:p>
     <w:p>
       <w:pPr>
-        <w:pStyle w:val="BodyText"/>
-      </w:pPr>
-      <w:r>
-        <w:t xml:space="preserve">Finzer, W. (2013). The data science education dilemma.</w:t>
+        <w:numPr>
+          <w:ilvl w:val="0"/>
+          <w:numId w:val="1001"/>
+        </w:numPr>
+      </w:pPr>
+      <w:r>
+        <w:t xml:space="preserve">W. Finzer, The data science education dilemma,</w:t>
       </w:r>
       <w:r>
         <w:t xml:space="preserve"> </w:t>
@@ -2827,12 +3965,12 @@
         <w:t xml:space="preserve">Technology Innovations in Statistics Education</w:t>
       </w:r>
       <w:r>
-        <w:t xml:space="preserve">, 7(2).</w:t>
-      </w:r>
-      <w:r>
-        <w:t xml:space="preserve"> </w:t>
-      </w:r>
-      <w:hyperlink r:id="rId31">
+        <w:t xml:space="preserve">, 7(2013).</w:t>
+      </w:r>
+      <w:r>
+        <w:t xml:space="preserve"> </w:t>
+      </w:r>
+      <w:hyperlink r:id="rId45">
         <w:r>
           <w:rPr>
             <w:rStyle w:val="Hyperlink"/>
@@ -2843,10 +3981,13 @@
     </w:p>
     <w:p>
       <w:pPr>
-        <w:pStyle w:val="BodyText"/>
-      </w:pPr>
-      <w:r>
-        <w:t xml:space="preserve">Garfield, J., &amp; Ben-Zvi, D. (2009). Helping students develop statistical reasoning: Implementing a statistical reasoning learning environment.</w:t>
+        <w:numPr>
+          <w:ilvl w:val="0"/>
+          <w:numId w:val="1001"/>
+        </w:numPr>
+      </w:pPr>
+      <w:r>
+        <w:t xml:space="preserve">J. Garfield, D. Ben-Zvi, Helping students develop statistical reasoning: Implementing a statistical reasoning learning environment,</w:t>
       </w:r>
       <w:r>
         <w:t xml:space="preserve"> </w:t>
@@ -2859,12 +4000,12 @@
         <w:t xml:space="preserve">Teaching Statistics</w:t>
       </w:r>
       <w:r>
-        <w:t xml:space="preserve">, 31(3), 72–77.</w:t>
-      </w:r>
-      <w:r>
-        <w:t xml:space="preserve"> </w:t>
-      </w:r>
-      <w:hyperlink r:id="rId32">
+        <w:t xml:space="preserve">, 31(2009), 72–77.</w:t>
+      </w:r>
+      <w:r>
+        <w:t xml:space="preserve"> </w:t>
+      </w:r>
+      <w:hyperlink r:id="rId46">
         <w:r>
           <w:rPr>
             <w:rStyle w:val="Hyperlink"/>
@@ -2875,10 +4016,83 @@
     </w:p>
     <w:p>
       <w:pPr>
-        <w:pStyle w:val="BodyText"/>
-      </w:pPr>
-      <w:r>
-        <w:t xml:space="preserve">Konold, C., &amp; Lehrer, R. (2008). Technology and mathematics education: An essay in honor of Jim Kaput. In L. D. English (Ed.),</w:t>
+        <w:numPr>
+          <w:ilvl w:val="0"/>
+          <w:numId w:val="1001"/>
+        </w:numPr>
+      </w:pPr>
+      <w:r>
+        <w:t xml:space="preserve">S. Gok, R. L. Goldstone, How do students reason about statistical sampling with computer simulations? An integrative review from a grounded cognition perspective,</w:t>
+      </w:r>
+      <w:r>
+        <w:t xml:space="preserve"> </w:t>
+      </w:r>
+      <w:r>
+        <w:rPr>
+          <w:i/>
+          <w:iCs/>
+        </w:rPr>
+        <w:t xml:space="preserve">Cognitive Research: Principles and Implications</w:t>
+      </w:r>
+      <w:r>
+        <w:t xml:space="preserve">, 9(2024), 33.</w:t>
+      </w:r>
+      <w:r>
+        <w:t xml:space="preserve"> </w:t>
+      </w:r>
+      <w:hyperlink r:id="rId47">
+        <w:r>
+          <w:rPr>
+            <w:rStyle w:val="Hyperlink"/>
+          </w:rPr>
+          <w:t xml:space="preserve">https://doi.org/10.1186/s41235-024-00561-x</w:t>
+        </w:r>
+      </w:hyperlink>
+    </w:p>
+    <w:p>
+      <w:pPr>
+        <w:numPr>
+          <w:ilvl w:val="0"/>
+          <w:numId w:val="1001"/>
+        </w:numPr>
+      </w:pPr>
+      <w:r>
+        <w:t xml:space="preserve">T. C. Hesterberg, What teachers should know about the bootstrap: Resampling in the undergraduate statistics curriculum,</w:t>
+      </w:r>
+      <w:r>
+        <w:t xml:space="preserve"> </w:t>
+      </w:r>
+      <w:r>
+        <w:rPr>
+          <w:i/>
+          <w:iCs/>
+        </w:rPr>
+        <w:t xml:space="preserve">The American Statistician</w:t>
+      </w:r>
+      <w:r>
+        <w:t xml:space="preserve">, 69(2015), 371–386.</w:t>
+      </w:r>
+      <w:r>
+        <w:t xml:space="preserve"> </w:t>
+      </w:r>
+      <w:hyperlink r:id="rId48">
+        <w:r>
+          <w:rPr>
+            <w:rStyle w:val="Hyperlink"/>
+          </w:rPr>
+          <w:t xml:space="preserve">https://doi.org/10.1080/00031305.2015.1089789</w:t>
+        </w:r>
+      </w:hyperlink>
+    </w:p>
+    <w:p>
+      <w:pPr>
+        <w:numPr>
+          <w:ilvl w:val="0"/>
+          <w:numId w:val="1001"/>
+        </w:numPr>
+      </w:pPr>
+      <w:r>
+        <w:t xml:space="preserve">C. Konold, R. Lehrer, Technology and mathematics education: An essay in honor of Jim Kaput, in: L. D. English (Ed.),</w:t>
       </w:r>
       <w:r>
         <w:t xml:space="preserve"> </w:t>
@@ -2891,18 +4105,56 @@
         <w:t xml:space="preserve">Handbook of International Research in Mathematics Education</w:t>
       </w:r>
       <w:r>
-        <w:t xml:space="preserve"> </w:t>
-      </w:r>
-      <w:r>
-        <w:t xml:space="preserve">(2nd ed.). Routledge.</w:t>
-      </w:r>
-    </w:p>
-    <w:p>
-      <w:pPr>
-        <w:pStyle w:val="BodyText"/>
-      </w:pPr>
-      <w:r>
-        <w:t xml:space="preserve">Matsumoto, M., &amp; Nishimura, T. (1998). Mersenne Twister: A 623-dimensionally equidistributed uniform pseudo-random number generator.</w:t>
+        <w:t xml:space="preserve">, 2nd ed., Routledge, 2008.</w:t>
+      </w:r>
+    </w:p>
+    <w:p>
+      <w:pPr>
+        <w:numPr>
+          <w:ilvl w:val="0"/>
+          <w:numId w:val="1001"/>
+        </w:numPr>
+      </w:pPr>
+      <w:r>
+        <w:t xml:space="preserve">R. H. Lock, P. F. Lock, K. Lock Morgan, E. F. Lock, D. F. Lock,</w:t>
+      </w:r>
+      <w:r>
+        <w:t xml:space="preserve"> </w:t>
+      </w:r>
+      <w:r>
+        <w:rPr>
+          <w:i/>
+          <w:iCs/>
+        </w:rPr>
+        <w:t xml:space="preserve">Statistics: Unlocking the Power of Data</w:t>
+      </w:r>
+      <w:r>
+        <w:t xml:space="preserve">, 3rd ed., Wiley, 2021. StatKey:</w:t>
+      </w:r>
+      <w:r>
+        <w:t xml:space="preserve"> </w:t>
+      </w:r>
+      <w:hyperlink r:id="rId49">
+        <w:r>
+          <w:rPr>
+            <w:rStyle w:val="Hyperlink"/>
+          </w:rPr>
+          <w:t xml:space="preserve">https://www.lock5stat.com/statkey</w:t>
+        </w:r>
+      </w:hyperlink>
+      <w:r>
+        <w:t xml:space="preserve">.</w:t>
+      </w:r>
+    </w:p>
+    <w:p>
+      <w:pPr>
+        <w:numPr>
+          <w:ilvl w:val="0"/>
+          <w:numId w:val="1001"/>
+        </w:numPr>
+      </w:pPr>
+      <w:r>
+        <w:t xml:space="preserve">M. Matsumoto, T. Nishimura, Mersenne Twister: A 623-dimensionally equidistributed uniform pseudo-random number generator,</w:t>
       </w:r>
       <w:r>
         <w:t xml:space="preserve"> </w:t>
@@ -2915,12 +4167,12 @@
         <w:t xml:space="preserve">ACM Transactions on Modeling and Computer Simulation</w:t>
       </w:r>
       <w:r>
-        <w:t xml:space="preserve">, 8(1), 3–30.</w:t>
-      </w:r>
-      <w:r>
-        <w:t xml:space="preserve"> </w:t>
-      </w:r>
-      <w:hyperlink r:id="rId33">
+        <w:t xml:space="preserve">, 8(1998), 3–30.</w:t>
+      </w:r>
+      <w:r>
+        <w:t xml:space="preserve"> </w:t>
+      </w:r>
+      <w:hyperlink r:id="rId50">
         <w:r>
           <w:rPr>
             <w:rStyle w:val="Hyperlink"/>
@@ -2931,10 +4183,13 @@
     </w:p>
     <w:p>
       <w:pPr>
-        <w:pStyle w:val="BodyText"/>
-      </w:pPr>
-      <w:r>
-        <w:t xml:space="preserve">Papert, S. (1980).</w:t>
+        <w:numPr>
+          <w:ilvl w:val="0"/>
+          <w:numId w:val="1001"/>
+        </w:numPr>
+      </w:pPr>
+      <w:r>
+        <w:t xml:space="preserve">S. Papert,</w:t>
       </w:r>
       <w:r>
         <w:t xml:space="preserve"> </w:t>
@@ -2947,15 +4202,18 @@
         <w:t xml:space="preserve">Mindstorms: Children, Computers, and Powerful Ideas</w:t>
       </w:r>
       <w:r>
-        <w:t xml:space="preserve">. Basic Books.</w:t>
-      </w:r>
-    </w:p>
-    <w:p>
-      <w:pPr>
-        <w:pStyle w:val="BodyText"/>
-      </w:pPr>
-      <w:r>
-        <w:t xml:space="preserve">Press, W. H., Teukolsky, S. A., Vetterling, W. T., &amp; Flannery, B. P. (2007).</w:t>
+        <w:t xml:space="preserve">, Basic Books, 1980.</w:t>
+      </w:r>
+    </w:p>
+    <w:p>
+      <w:pPr>
+        <w:numPr>
+          <w:ilvl w:val="0"/>
+          <w:numId w:val="1001"/>
+        </w:numPr>
+      </w:pPr>
+      <w:r>
+        <w:t xml:space="preserve">W. H. Press, S. A. Teukolsky, W. T. Vetterling, B. P. Flannery,</w:t>
       </w:r>
       <w:r>
         <w:t xml:space="preserve"> </w:t>
@@ -2968,18 +4226,53 @@
         <w:t xml:space="preserve">Numerical Recipes: The Art of Scientific Computing</w:t>
       </w:r>
       <w:r>
-        <w:t xml:space="preserve"> </w:t>
-      </w:r>
-      <w:r>
-        <w:t xml:space="preserve">(3rd ed.). Cambridge University Press.</w:t>
-      </w:r>
-    </w:p>
-    <w:p>
-      <w:pPr>
-        <w:pStyle w:val="BodyText"/>
-      </w:pPr>
-      <w:r>
-        <w:t xml:space="preserve">Tintle, N., Chance, B., Cobb, G., Roy, S., Swanson, T., &amp; VanderStoep, J. (2015). Combating anti-statistical thinking using simulation-based methods throughout the undergraduate curriculum.</w:t>
+        <w:t xml:space="preserve">, 3rd ed., Cambridge University Press, 2007.</w:t>
+      </w:r>
+    </w:p>
+    <w:p>
+      <w:pPr>
+        <w:numPr>
+          <w:ilvl w:val="0"/>
+          <w:numId w:val="1001"/>
+        </w:numPr>
+      </w:pPr>
+      <w:r>
+        <w:t xml:space="preserve">A. Rossman, B. Chance, Using simulation-based inference for learning introductory statistics,</w:t>
+      </w:r>
+      <w:r>
+        <w:t xml:space="preserve"> </w:t>
+      </w:r>
+      <w:r>
+        <w:rPr>
+          <w:i/>
+          <w:iCs/>
+        </w:rPr>
+        <w:t xml:space="preserve">WIREs Computational Statistics</w:t>
+      </w:r>
+      <w:r>
+        <w:t xml:space="preserve">, 6(2014), 211–221.</w:t>
+      </w:r>
+      <w:r>
+        <w:t xml:space="preserve"> </w:t>
+      </w:r>
+      <w:hyperlink r:id="rId51">
+        <w:r>
+          <w:rPr>
+            <w:rStyle w:val="Hyperlink"/>
+          </w:rPr>
+          <w:t xml:space="preserve">https://doi.org/10.1002/wics.1302</w:t>
+        </w:r>
+      </w:hyperlink>
+    </w:p>
+    <w:p>
+      <w:pPr>
+        <w:numPr>
+          <w:ilvl w:val="0"/>
+          <w:numId w:val="1001"/>
+        </w:numPr>
+      </w:pPr>
+      <w:r>
+        <w:t xml:space="preserve">N. Tintle, B. Chance, G. Cobb, S. Roy, T. Swanson, J. VanderStoep, Combating anti-statistical thinking using simulation-based methods throughout the undergraduate curriculum,</w:t>
       </w:r>
       <w:r>
         <w:t xml:space="preserve"> </w:t>
@@ -2992,12 +4285,12 @@
         <w:t xml:space="preserve">The American Statistician</w:t>
       </w:r>
       <w:r>
-        <w:t xml:space="preserve">, 69(4), 362–370.</w:t>
-      </w:r>
-      <w:r>
-        <w:t xml:space="preserve"> </w:t>
-      </w:r>
-      <w:hyperlink r:id="rId34">
+        <w:t xml:space="preserve">, 69(2015), 362–370.</w:t>
+      </w:r>
+      <w:r>
+        <w:t xml:space="preserve"> </w:t>
+      </w:r>
+      <w:hyperlink r:id="rId52">
         <w:r>
           <w:rPr>
             <w:rStyle w:val="Hyperlink"/>
@@ -3008,10 +4301,13 @@
     </w:p>
     <w:p>
       <w:pPr>
-        <w:pStyle w:val="BodyText"/>
-      </w:pPr>
-      <w:r>
-        <w:t xml:space="preserve">Wilensky, U. (1999).</w:t>
+        <w:numPr>
+          <w:ilvl w:val="0"/>
+          <w:numId w:val="1001"/>
+        </w:numPr>
+      </w:pPr>
+      <w:r>
+        <w:t xml:space="preserve">U. Wilensky,</w:t>
       </w:r>
       <w:r>
         <w:t xml:space="preserve"> </w:t>
@@ -3024,12 +4320,12 @@
         <w:t xml:space="preserve">NetLogo</w:t>
       </w:r>
       <w:r>
-        <w:t xml:space="preserve">. Center for Connected Learning and Computer-Based Modeling, Northwestern University.</w:t>
-      </w:r>
-      <w:r>
-        <w:t xml:space="preserve"> </w:t>
-      </w:r>
-      <w:hyperlink r:id="rId35">
+        <w:t xml:space="preserve">, Center for Connected Learning and Computer-Based Modeling, Northwestern University, 1999.</w:t>
+      </w:r>
+      <w:r>
+        <w:t xml:space="preserve"> </w:t>
+      </w:r>
+      <w:hyperlink r:id="rId53">
         <w:r>
           <w:rPr>
             <w:rStyle w:val="Hyperlink"/>
@@ -3038,7 +4334,7 @@
         </w:r>
       </w:hyperlink>
     </w:p>
-    <w:bookmarkEnd w:id="36"/>
+    <w:bookmarkEnd w:id="54"/>
     <w:sectPr>
       <w:footnotePr>
         <w:numRestart w:val="eachSect"/>
@@ -3149,8 +4445,123 @@
       </w:pPr>
     </w:lvl>
   </w:abstractNum>
+  <w:abstractNum w:abstractNumId="99411">
+    <w:nsid w:val="00A99411"/>
+    <w:multiLevelType w:val="multilevel"/>
+    <w:lvl w:ilvl="0">
+      <w:start w:val="1"/>
+      <w:numFmt w:val="decimal"/>
+      <w:lvlText w:val="%1."/>
+      <w:lvlJc w:val="left"/>
+      <w:pPr>
+        <w:ind w:left="720" w:hanging="360"/>
+      </w:pPr>
+    </w:lvl>
+    <w:lvl w:ilvl="1">
+      <w:start w:val="1"/>
+      <w:numFmt w:val="decimal"/>
+      <w:lvlText w:val="%2."/>
+      <w:lvlJc w:val="left"/>
+      <w:pPr>
+        <w:ind w:left="1440" w:hanging="360"/>
+      </w:pPr>
+    </w:lvl>
+    <w:lvl w:ilvl="2">
+      <w:start w:val="1"/>
+      <w:numFmt w:val="decimal"/>
+      <w:lvlText w:val="%3."/>
+      <w:lvlJc w:val="left"/>
+      <w:pPr>
+        <w:ind w:left="2160" w:hanging="360"/>
+      </w:pPr>
+    </w:lvl>
+    <w:lvl w:ilvl="3">
+      <w:start w:val="1"/>
+      <w:numFmt w:val="decimal"/>
+      <w:lvlText w:val="%4."/>
+      <w:lvlJc w:val="left"/>
+      <w:pPr>
+        <w:ind w:left="2880" w:hanging="360"/>
+      </w:pPr>
+    </w:lvl>
+    <w:lvl w:ilvl="4">
+      <w:start w:val="1"/>
+      <w:numFmt w:val="decimal"/>
+      <w:lvlText w:val="%5."/>
+      <w:lvlJc w:val="left"/>
+      <w:pPr>
+        <w:ind w:left="3600" w:hanging="360"/>
+      </w:pPr>
+    </w:lvl>
+    <w:lvl w:ilvl="5">
+      <w:start w:val="1"/>
+      <w:numFmt w:val="decimal"/>
+      <w:lvlText w:val="%6."/>
+      <w:lvlJc w:val="left"/>
+      <w:pPr>
+        <w:ind w:left="4320" w:hanging="360"/>
+      </w:pPr>
+    </w:lvl>
+    <w:lvl w:ilvl="6">
+      <w:start w:val="1"/>
+      <w:numFmt w:val="decimal"/>
+      <w:lvlText w:val="%7."/>
+      <w:lvlJc w:val="left"/>
+      <w:pPr>
+        <w:ind w:left="5040" w:hanging="360"/>
+      </w:pPr>
+    </w:lvl>
+    <w:lvl w:ilvl="7">
+      <w:start w:val="1"/>
+      <w:numFmt w:val="decimal"/>
+      <w:lvlText w:val="%8."/>
+      <w:lvlJc w:val="left"/>
+      <w:pPr>
+        <w:ind w:left="5760" w:hanging="360"/>
+      </w:pPr>
+    </w:lvl>
+    <w:lvl w:ilvl="8">
+      <w:start w:val="1"/>
+      <w:numFmt w:val="decimal"/>
+      <w:lvlText w:val="%9."/>
+      <w:lvlJc w:val="left"/>
+      <w:pPr>
+        <w:ind w:left="6480" w:hanging="360"/>
+      </w:pPr>
+    </w:lvl>
+  </w:abstractNum>
   <w:num w:numId="1000">
     <w:abstractNumId w:val="990"/>
+  </w:num>
+  <w:num w:numId="1001">
+    <w:abstractNumId w:val="99411"/>
+    <w:lvlOverride w:ilvl="0">
+      <w:startOverride w:val="1"/>
+    </w:lvlOverride>
+    <w:lvlOverride w:ilvl="1">
+      <w:startOverride w:val="1"/>
+    </w:lvlOverride>
+    <w:lvlOverride w:ilvl="2">
+      <w:startOverride w:val="1"/>
+    </w:lvlOverride>
+    <w:lvlOverride w:ilvl="3">
+      <w:startOverride w:val="1"/>
+    </w:lvlOverride>
+    <w:lvlOverride w:ilvl="4">
+      <w:startOverride w:val="1"/>
+    </w:lvlOverride>
+    <w:lvlOverride w:ilvl="5">
+      <w:startOverride w:val="1"/>
+    </w:lvlOverride>
+    <w:lvlOverride w:ilvl="6">
+      <w:startOverride w:val="1"/>
+    </w:lvlOverride>
+    <w:lvlOverride w:ilvl="7">
+      <w:startOverride w:val="1"/>
+    </w:lvlOverride>
+    <w:lvlOverride w:ilvl="8">
+      <w:startOverride w:val="1"/>
+    </w:lvlOverride>
   </w:num>
 </w:numbering>
 </file>

</xml_diff>

<commit_message>
Rename Supporting Information appendix to Supplementary Materials
Co-Authored-By: Claude Opus 4.7 (1M context) <noreply@anthropic.com>
</commit_message>
<xml_diff>
--- a/submission/manuscript.docx
+++ b/submission/manuscript.docx
@@ -3305,7 +3305,7 @@
     </w:p>
     <w:bookmarkEnd w:id="33"/>
     <w:bookmarkEnd w:id="34"/>
-    <w:bookmarkStart w:id="36" w:name="data-and-code-availability"/>
+    <w:bookmarkStart w:id="37" w:name="data-and-code-availability"/>
     <w:p>
       <w:pPr>
         <w:pStyle w:val="Heading1"/>
@@ -3371,35 +3371,49 @@
         <w:t xml:space="preserve"> </w:t>
       </w:r>
       <w:r>
-        <w:t xml:space="preserve">version described here is tagged in the repository, and a snapshot of that</w:t>
-      </w:r>
-      <w:r>
-        <w:t xml:space="preserve"> </w:t>
-      </w:r>
-      <w:r>
-        <w:t xml:space="preserve">version will be archived with a permanent DOI (Zenodo) upon acceptance, so that</w:t>
-      </w:r>
-      <w:r>
-        <w:t xml:space="preserve"> </w:t>
-      </w:r>
-      <w:r>
-        <w:t xml:space="preserve">the reviewed software remains citable independently of later development. The</w:t>
-      </w:r>
-      <w:r>
-        <w:t xml:space="preserve"> </w:t>
-      </w:r>
-      <w:r>
-        <w:t xml:space="preserve">figures in this article are screenshots of the running application; the patches</w:t>
-      </w:r>
-      <w:r>
-        <w:t xml:space="preserve"> </w:t>
-      </w:r>
-      <w:r>
-        <w:t xml:space="preserve">that generate them are included among the bundled lessons.</w:t>
-      </w:r>
-    </w:p>
-    <w:bookmarkEnd w:id="36"/>
-    <w:bookmarkStart w:id="37" w:name="limitations-and-future-work"/>
+        <w:t xml:space="preserve">version described here is tagged as v2.1.0 in the repository and archived on</w:t>
+      </w:r>
+      <w:r>
+        <w:t xml:space="preserve"> </w:t>
+      </w:r>
+      <w:r>
+        <w:t xml:space="preserve">Zenodo (DOI:</w:t>
+      </w:r>
+      <w:r>
+        <w:t xml:space="preserve"> </w:t>
+      </w:r>
+      <w:hyperlink r:id="rId36">
+        <w:r>
+          <w:rPr>
+            <w:rStyle w:val="Hyperlink"/>
+          </w:rPr>
+          <w:t xml:space="preserve">https://doi.org/10.5281/zenodo.20413213</w:t>
+        </w:r>
+      </w:hyperlink>
+      <w:r>
+        <w:t xml:space="preserve">), so that the reviewed</w:t>
+      </w:r>
+      <w:r>
+        <w:t xml:space="preserve"> </w:t>
+      </w:r>
+      <w:r>
+        <w:t xml:space="preserve">software remains citable independently of later development. The figures in this</w:t>
+      </w:r>
+      <w:r>
+        <w:t xml:space="preserve"> </w:t>
+      </w:r>
+      <w:r>
+        <w:t xml:space="preserve">article are screenshots of the running application; the patches that generate</w:t>
+      </w:r>
+      <w:r>
+        <w:t xml:space="preserve"> </w:t>
+      </w:r>
+      <w:r>
+        <w:t xml:space="preserve">them are included among the bundled lessons.</w:t>
+      </w:r>
+    </w:p>
+    <w:bookmarkEnd w:id="37"/>
+    <w:bookmarkStart w:id="38" w:name="limitations-and-future-work"/>
     <w:p>
       <w:pPr>
         <w:pStyle w:val="Heading1"/>
@@ -3638,8 +3652,8 @@
         <w:t xml:space="preserve">implementation.</w:t>
       </w:r>
     </w:p>
-    <w:bookmarkEnd w:id="37"/>
-    <w:bookmarkStart w:id="38" w:name="conclusion"/>
+    <w:bookmarkEnd w:id="38"/>
+    <w:bookmarkStart w:id="39" w:name="conclusion"/>
     <w:p>
       <w:pPr>
         <w:pStyle w:val="Heading1"/>
@@ -3692,8 +3706,8 @@
         <w:t xml:space="preserve">learn from and an instructor can verify.</w:t>
       </w:r>
     </w:p>
-    <w:bookmarkEnd w:id="38"/>
-    <w:bookmarkStart w:id="39" w:name="disclosure-statement"/>
+    <w:bookmarkEnd w:id="39"/>
+    <w:bookmarkStart w:id="40" w:name="disclosure-statement"/>
     <w:p>
       <w:pPr>
         <w:pStyle w:val="Heading1"/>
@@ -3759,8 +3773,8 @@
         <w:t xml:space="preserve">manuscript.</w:t>
       </w:r>
     </w:p>
-    <w:bookmarkEnd w:id="39"/>
-    <w:bookmarkStart w:id="54" w:name="references"/>
+    <w:bookmarkEnd w:id="40"/>
+    <w:bookmarkStart w:id="55" w:name="references"/>
     <w:p>
       <w:pPr>
         <w:pStyle w:val="Heading1"/>
@@ -3795,7 +3809,7 @@
       <w:r>
         <w:t xml:space="preserve"> </w:t>
       </w:r>
-      <w:hyperlink r:id="rId40">
+      <w:hyperlink r:id="rId41">
         <w:r>
           <w:rPr>
             <w:rStyle w:val="Hyperlink"/>
@@ -3830,7 +3844,7 @@
       <w:r>
         <w:t xml:space="preserve"> </w:t>
       </w:r>
-      <w:hyperlink r:id="rId41">
+      <w:hyperlink r:id="rId42">
         <w:r>
           <w:rPr>
             <w:rStyle w:val="Hyperlink"/>
@@ -3865,7 +3879,7 @@
       <w:r>
         <w:t xml:space="preserve"> </w:t>
       </w:r>
-      <w:hyperlink r:id="rId42">
+      <w:hyperlink r:id="rId43">
         <w:r>
           <w:rPr>
             <w:rStyle w:val="Hyperlink"/>
@@ -3900,7 +3914,7 @@
       <w:r>
         <w:t xml:space="preserve"> </w:t>
       </w:r>
-      <w:hyperlink r:id="rId43">
+      <w:hyperlink r:id="rId44">
         <w:r>
           <w:rPr>
             <w:rStyle w:val="Hyperlink"/>
@@ -3935,7 +3949,7 @@
       <w:r>
         <w:t xml:space="preserve"> </w:t>
       </w:r>
-      <w:hyperlink r:id="rId44">
+      <w:hyperlink r:id="rId45">
         <w:r>
           <w:rPr>
             <w:rStyle w:val="Hyperlink"/>
@@ -3970,7 +3984,7 @@
       <w:r>
         <w:t xml:space="preserve"> </w:t>
       </w:r>
-      <w:hyperlink r:id="rId45">
+      <w:hyperlink r:id="rId46">
         <w:r>
           <w:rPr>
             <w:rStyle w:val="Hyperlink"/>
@@ -4005,7 +4019,7 @@
       <w:r>
         <w:t xml:space="preserve"> </w:t>
       </w:r>
-      <w:hyperlink r:id="rId46">
+      <w:hyperlink r:id="rId47">
         <w:r>
           <w:rPr>
             <w:rStyle w:val="Hyperlink"/>
@@ -4040,7 +4054,7 @@
       <w:r>
         <w:t xml:space="preserve"> </w:t>
       </w:r>
-      <w:hyperlink r:id="rId47">
+      <w:hyperlink r:id="rId48">
         <w:r>
           <w:rPr>
             <w:rStyle w:val="Hyperlink"/>
@@ -4075,7 +4089,7 @@
       <w:r>
         <w:t xml:space="preserve"> </w:t>
       </w:r>
-      <w:hyperlink r:id="rId48">
+      <w:hyperlink r:id="rId49">
         <w:r>
           <w:rPr>
             <w:rStyle w:val="Hyperlink"/>
@@ -4134,7 +4148,7 @@
       <w:r>
         <w:t xml:space="preserve"> </w:t>
       </w:r>
-      <w:hyperlink r:id="rId49">
+      <w:hyperlink r:id="rId50">
         <w:r>
           <w:rPr>
             <w:rStyle w:val="Hyperlink"/>
@@ -4172,7 +4186,7 @@
       <w:r>
         <w:t xml:space="preserve"> </w:t>
       </w:r>
-      <w:hyperlink r:id="rId50">
+      <w:hyperlink r:id="rId51">
         <w:r>
           <w:rPr>
             <w:rStyle w:val="Hyperlink"/>
@@ -4255,7 +4269,7 @@
       <w:r>
         <w:t xml:space="preserve"> </w:t>
       </w:r>
-      <w:hyperlink r:id="rId51">
+      <w:hyperlink r:id="rId52">
         <w:r>
           <w:rPr>
             <w:rStyle w:val="Hyperlink"/>
@@ -4290,7 +4304,7 @@
       <w:r>
         <w:t xml:space="preserve"> </w:t>
       </w:r>
-      <w:hyperlink r:id="rId52">
+      <w:hyperlink r:id="rId53">
         <w:r>
           <w:rPr>
             <w:rStyle w:val="Hyperlink"/>
@@ -4325,7 +4339,7 @@
       <w:r>
         <w:t xml:space="preserve"> </w:t>
       </w:r>
-      <w:hyperlink r:id="rId53">
+      <w:hyperlink r:id="rId54">
         <w:r>
           <w:rPr>
             <w:rStyle w:val="Hyperlink"/>
@@ -4334,7 +4348,7 @@
         </w:r>
       </w:hyperlink>
     </w:p>
-    <w:bookmarkEnd w:id="54"/>
+    <w:bookmarkEnd w:id="55"/>
     <w:sectPr>
       <w:footnotePr>
         <w:numRestart w:val="eachSect"/>

</xml_diff>